<commit_message>
feat(customer): add mobile contact export generator for Google Contacts CSV and vCard with [MM] caller ID and label sync
</commit_message>
<xml_diff>
--- a/Container_Expense_Statement_Form_RoundLogo.docx
+++ b/Container_Expense_Statement_Form_RoundLogo.docx
@@ -10,7 +10,7 @@
         <w:tblLook w:val="04A0" w:firstRow="1" w:lastRow="0" w:firstColumn="1" w:lastColumn="0" w:noHBand="0" w:noVBand="1"/>
       </w:tblPr>
       <w:tblGrid>
-        <w:gridCol w:w="1584"/>
+        <w:gridCol w:w="2146"/>
         <w:gridCol w:w="6264"/>
         <w:gridCol w:w="2765"/>
       </w:tblGrid>
@@ -20,7 +20,7 @@
         </w:trPr>
         <w:tc>
           <w:tcPr>
-            <w:tcW w:w="1584" w:type="dxa"/>
+            <w:tcW w:w="2146" w:type="dxa"/>
             <w:tcBorders>
               <w:top w:val="none" w:sz="4" w:space="0" w:color="auto"/>
               <w:left w:val="none" w:sz="4" w:space="0" w:color="auto"/>
@@ -369,11 +369,20 @@
     </w:tbl>
     <w:p>
       <w:pPr>
+        <w:tabs>
+          <w:tab w:val="left" w:pos="8360"/>
+        </w:tabs>
         <w:spacing w:after="60" w:line="240" w:lineRule="auto"/>
         <w:rPr>
           <w:rFonts w:ascii="Hind Siliguri" w:hAnsi="Hind Siliguri" w:cs="Hind Siliguri"/>
         </w:rPr>
       </w:pPr>
+      <w:r>
+        <w:rPr>
+          <w:rFonts w:ascii="Hind Siliguri" w:hAnsi="Hind Siliguri" w:cs="Hind Siliguri"/>
+        </w:rPr>
+        <w:tab/>
+      </w:r>
     </w:p>
     <w:tbl>
       <w:tblPr>
@@ -383,9 +392,9 @@
         <w:tblLook w:val="04A0" w:firstRow="1" w:lastRow="0" w:firstColumn="1" w:lastColumn="0" w:noHBand="0" w:noVBand="1"/>
       </w:tblPr>
       <w:tblGrid>
-        <w:gridCol w:w="2695"/>
-        <w:gridCol w:w="2874"/>
-        <w:gridCol w:w="2155"/>
+        <w:gridCol w:w="3070"/>
+        <w:gridCol w:w="2880"/>
+        <w:gridCol w:w="2355"/>
         <w:gridCol w:w="2867"/>
       </w:tblGrid>
       <w:tr>
@@ -395,7 +404,7 @@
         </w:trPr>
         <w:tc>
           <w:tcPr>
-            <w:tcW w:w="2695" w:type="dxa"/>
+            <w:tcW w:w="3070" w:type="dxa"/>
             <w:tcBorders>
               <w:top w:val="single" w:sz="4" w:space="0" w:color="CBD5E1"/>
               <w:left w:val="single" w:sz="4" w:space="0" w:color="CBD5E1"/>
@@ -415,8 +424,8 @@
               <w:spacing w:after="0" w:line="240" w:lineRule="auto"/>
               <w:rPr>
                 <w:rFonts w:ascii="Hind Siliguri" w:hAnsi="Hind Siliguri" w:cs="Hind Siliguri"/>
-                <w:sz w:val="16"/>
-                <w:szCs w:val="16"/>
+                <w:sz w:val="20"/>
+                <w:szCs w:val="20"/>
               </w:rPr>
             </w:pPr>
             <w:proofErr w:type="spellStart"/>
@@ -424,9 +433,9 @@
               <w:rPr>
                 <w:rFonts w:ascii="Hind Siliguri" w:hAnsi="Hind Siliguri" w:cs="Hind Siliguri"/>
                 <w:b/>
-                <w:color w:val="0369A1"/>
-                <w:sz w:val="16"/>
-                <w:szCs w:val="16"/>
+                <w:color w:val="943634" w:themeColor="accent2" w:themeShade="BF"/>
+                <w:sz w:val="20"/>
+                <w:szCs w:val="20"/>
               </w:rPr>
               <w:t>কন্টেইনার</w:t>
             </w:r>
@@ -435,9 +444,9 @@
               <w:rPr>
                 <w:rFonts w:ascii="Hind Siliguri" w:hAnsi="Hind Siliguri" w:cs="Hind Siliguri"/>
                 <w:b/>
-                <w:color w:val="0369A1"/>
-                <w:sz w:val="16"/>
-                <w:szCs w:val="16"/>
+                <w:color w:val="943634" w:themeColor="accent2" w:themeShade="BF"/>
+                <w:sz w:val="20"/>
+                <w:szCs w:val="20"/>
               </w:rPr>
               <w:t xml:space="preserve"> </w:t>
             </w:r>
@@ -446,9 +455,9 @@
               <w:rPr>
                 <w:rFonts w:ascii="Hind Siliguri" w:hAnsi="Hind Siliguri" w:cs="Hind Siliguri"/>
                 <w:b/>
-                <w:color w:val="0369A1"/>
-                <w:sz w:val="16"/>
-                <w:szCs w:val="16"/>
+                <w:color w:val="943634" w:themeColor="accent2" w:themeShade="BF"/>
+                <w:sz w:val="20"/>
+                <w:szCs w:val="20"/>
               </w:rPr>
               <w:t>নং</w:t>
             </w:r>
@@ -457,9 +466,9 @@
               <w:rPr>
                 <w:rFonts w:ascii="Hind Siliguri" w:hAnsi="Hind Siliguri" w:cs="Hind Siliguri"/>
                 <w:b/>
-                <w:color w:val="0369A1"/>
-                <w:sz w:val="16"/>
-                <w:szCs w:val="16"/>
+                <w:color w:val="943634" w:themeColor="accent2" w:themeShade="BF"/>
+                <w:sz w:val="20"/>
+                <w:szCs w:val="20"/>
               </w:rPr>
               <w:t>:</w:t>
             </w:r>
@@ -467,7 +476,7 @@
         </w:tc>
         <w:tc>
           <w:tcPr>
-            <w:tcW w:w="2874" w:type="dxa"/>
+            <w:tcW w:w="2880" w:type="dxa"/>
             <w:tcBorders>
               <w:top w:val="single" w:sz="4" w:space="0" w:color="CBD5E1"/>
               <w:left w:val="single" w:sz="4" w:space="0" w:color="CBD5E1"/>
@@ -487,25 +496,81 @@
               <w:spacing w:after="0" w:line="240" w:lineRule="auto"/>
               <w:rPr>
                 <w:rFonts w:ascii="Hind Siliguri" w:hAnsi="Hind Siliguri" w:cs="Hind Siliguri"/>
-                <w:sz w:val="16"/>
-                <w:szCs w:val="16"/>
+                <w:sz w:val="20"/>
+                <w:szCs w:val="20"/>
               </w:rPr>
             </w:pPr>
+            <w:proofErr w:type="spellStart"/>
             <w:r>
               <w:rPr>
                 <w:rFonts w:ascii="Hind Siliguri" w:hAnsi="Hind Siliguri" w:cs="Hind Siliguri"/>
                 <w:b/>
-                <w:color w:val="0369A1"/>
-                <w:sz w:val="16"/>
-                <w:szCs w:val="16"/>
-              </w:rPr>
-              <w:t>কন্টেইনার সাইজ ফুট:</w:t>
+                <w:color w:val="943634" w:themeColor="accent2" w:themeShade="BF"/>
+                <w:sz w:val="20"/>
+                <w:szCs w:val="20"/>
+              </w:rPr>
+              <w:t>কন্টেইনার</w:t>
+            </w:r>
+            <w:proofErr w:type="spellEnd"/>
+            <w:r>
+              <w:rPr>
+                <w:rFonts w:ascii="Hind Siliguri" w:hAnsi="Hind Siliguri" w:cs="Hind Siliguri"/>
+                <w:b/>
+                <w:color w:val="943634" w:themeColor="accent2" w:themeShade="BF"/>
+                <w:sz w:val="20"/>
+                <w:szCs w:val="20"/>
+              </w:rPr>
+              <w:t xml:space="preserve"> </w:t>
+            </w:r>
+            <w:proofErr w:type="spellStart"/>
+            <w:r>
+              <w:rPr>
+                <w:rFonts w:ascii="Hind Siliguri" w:hAnsi="Hind Siliguri" w:cs="Hind Siliguri"/>
+                <w:b/>
+                <w:color w:val="943634" w:themeColor="accent2" w:themeShade="BF"/>
+                <w:sz w:val="20"/>
+                <w:szCs w:val="20"/>
+              </w:rPr>
+              <w:t>সাইজ</w:t>
+            </w:r>
+            <w:proofErr w:type="spellEnd"/>
+            <w:r>
+              <w:rPr>
+                <w:rFonts w:ascii="Hind Siliguri" w:hAnsi="Hind Siliguri" w:cs="Hind Siliguri"/>
+                <w:b/>
+                <w:color w:val="943634" w:themeColor="accent2" w:themeShade="BF"/>
+                <w:sz w:val="20"/>
+                <w:szCs w:val="20"/>
+              </w:rPr>
+              <w:t xml:space="preserve"> </w:t>
+            </w:r>
+            <w:proofErr w:type="spellStart"/>
+            <w:r>
+              <w:rPr>
+                <w:rFonts w:ascii="Hind Siliguri" w:hAnsi="Hind Siliguri" w:cs="Hind Siliguri"/>
+                <w:b/>
+                <w:color w:val="943634" w:themeColor="accent2" w:themeShade="BF"/>
+                <w:sz w:val="20"/>
+                <w:szCs w:val="20"/>
+              </w:rPr>
+              <w:t>ফুট</w:t>
+            </w:r>
+            <w:proofErr w:type="spellEnd"/>
+            <w:r>
+              <w:rPr>
+                <w:rFonts w:ascii="Hind Siliguri" w:hAnsi="Hind Siliguri" w:cs="Hind Siliguri"/>
+                <w:b/>
+                <w:color w:val="943634" w:themeColor="accent2" w:themeShade="BF"/>
+                <w:sz w:val="20"/>
+                <w:szCs w:val="20"/>
+              </w:rPr>
+              <w:t>:</w:t>
             </w:r>
           </w:p>
         </w:tc>
         <w:tc>
           <w:tcPr>
-            <w:tcW w:w="2155" w:type="dxa"/>
+            <w:tcW w:w="2355" w:type="dxa"/>
             <w:tcBorders>
               <w:top w:val="single" w:sz="4" w:space="0" w:color="CBD5E1"/>
               <w:left w:val="single" w:sz="4" w:space="0" w:color="CBD5E1"/>
@@ -525,17 +590,17 @@
               <w:spacing w:after="0" w:line="240" w:lineRule="auto"/>
               <w:rPr>
                 <w:rFonts w:ascii="Hind Siliguri" w:hAnsi="Hind Siliguri" w:cs="Hind Siliguri"/>
-                <w:sz w:val="16"/>
-                <w:szCs w:val="16"/>
+                <w:sz w:val="20"/>
+                <w:szCs w:val="20"/>
               </w:rPr>
             </w:pPr>
             <w:r>
               <w:rPr>
                 <w:rFonts w:ascii="Hind Siliguri" w:hAnsi="Hind Siliguri" w:cs="Hind Siliguri"/>
                 <w:b/>
-                <w:color w:val="0369A1"/>
-                <w:sz w:val="16"/>
-                <w:szCs w:val="16"/>
+                <w:color w:val="943634" w:themeColor="accent2" w:themeShade="BF"/>
+                <w:sz w:val="20"/>
+                <w:szCs w:val="20"/>
               </w:rPr>
               <w:t>L/C No:</w:t>
             </w:r>
@@ -563,19 +628,19 @@
               <w:spacing w:after="0" w:line="240" w:lineRule="auto"/>
               <w:rPr>
                 <w:rFonts w:ascii="Hind Siliguri" w:hAnsi="Hind Siliguri" w:cs="Hind Siliguri"/>
-                <w:sz w:val="16"/>
-                <w:szCs w:val="16"/>
+                <w:sz w:val="20"/>
+                <w:szCs w:val="20"/>
               </w:rPr>
             </w:pPr>
             <w:r>
               <w:rPr>
                 <w:rFonts w:ascii="Hind Siliguri" w:hAnsi="Hind Siliguri" w:cs="Hind Siliguri"/>
                 <w:b/>
-                <w:color w:val="0369A1"/>
-                <w:sz w:val="16"/>
-                <w:szCs w:val="16"/>
-              </w:rPr>
-              <w:t>ইনভয়েস মূল্য (U$D):</w:t>
+                <w:color w:val="943634" w:themeColor="accent2" w:themeShade="BF"/>
+                <w:sz w:val="20"/>
+                <w:szCs w:val="20"/>
+              </w:rPr>
+              <w:t>U$D:</w:t>
             </w:r>
           </w:p>
         </w:tc>
@@ -587,7 +652,7 @@
         </w:trPr>
         <w:tc>
           <w:tcPr>
-            <w:tcW w:w="2695" w:type="dxa"/>
+            <w:tcW w:w="3070" w:type="dxa"/>
             <w:tcBorders>
               <w:top w:val="single" w:sz="4" w:space="0" w:color="CBD5E1"/>
               <w:left w:val="single" w:sz="4" w:space="0" w:color="CBD5E1"/>
@@ -607,8 +672,8 @@
               <w:spacing w:after="0" w:line="240" w:lineRule="auto"/>
               <w:rPr>
                 <w:rFonts w:ascii="Hind Siliguri" w:hAnsi="Hind Siliguri" w:cs="Hind Siliguri"/>
-                <w:sz w:val="16"/>
-                <w:szCs w:val="16"/>
+                <w:sz w:val="20"/>
+                <w:szCs w:val="20"/>
               </w:rPr>
             </w:pPr>
             <w:proofErr w:type="spellStart"/>
@@ -616,9 +681,9 @@
               <w:rPr>
                 <w:rFonts w:ascii="Hind Siliguri" w:hAnsi="Hind Siliguri" w:cs="Hind Siliguri"/>
                 <w:b/>
-                <w:color w:val="0369A1"/>
-                <w:sz w:val="16"/>
-                <w:szCs w:val="16"/>
+                <w:color w:val="8064A2" w:themeColor="accent4"/>
+                <w:sz w:val="20"/>
+                <w:szCs w:val="20"/>
               </w:rPr>
               <w:t>লোডিং</w:t>
             </w:r>
@@ -627,17 +692,39 @@
               <w:rPr>
                 <w:rFonts w:ascii="Hind Siliguri" w:hAnsi="Hind Siliguri" w:cs="Hind Siliguri"/>
                 <w:b/>
-                <w:color w:val="0369A1"/>
-                <w:sz w:val="16"/>
-                <w:szCs w:val="16"/>
-              </w:rPr>
-              <w:t xml:space="preserve"> তারিখ:</w:t>
+                <w:color w:val="8064A2" w:themeColor="accent4"/>
+                <w:sz w:val="20"/>
+                <w:szCs w:val="20"/>
+              </w:rPr>
+              <w:t xml:space="preserve"> </w:t>
+            </w:r>
+            <w:proofErr w:type="spellStart"/>
+            <w:r>
+              <w:rPr>
+                <w:rFonts w:ascii="Hind Siliguri" w:hAnsi="Hind Siliguri" w:cs="Hind Siliguri"/>
+                <w:b/>
+                <w:color w:val="8064A2" w:themeColor="accent4"/>
+                <w:sz w:val="20"/>
+                <w:szCs w:val="20"/>
+              </w:rPr>
+              <w:t>তারিখ</w:t>
+            </w:r>
+            <w:proofErr w:type="spellEnd"/>
+            <w:r>
+              <w:rPr>
+                <w:rFonts w:ascii="Hind Siliguri" w:hAnsi="Hind Siliguri" w:cs="Hind Siliguri"/>
+                <w:b/>
+                <w:color w:val="8064A2" w:themeColor="accent4"/>
+                <w:sz w:val="20"/>
+                <w:szCs w:val="20"/>
+              </w:rPr>
+              <w:t>:</w:t>
             </w:r>
           </w:p>
         </w:tc>
         <w:tc>
           <w:tcPr>
-            <w:tcW w:w="2874" w:type="dxa"/>
+            <w:tcW w:w="2880" w:type="dxa"/>
             <w:tcBorders>
               <w:top w:val="single" w:sz="4" w:space="0" w:color="CBD5E1"/>
               <w:left w:val="single" w:sz="4" w:space="0" w:color="CBD5E1"/>
@@ -657,17 +744,17 @@
               <w:spacing w:after="0" w:line="240" w:lineRule="auto"/>
               <w:rPr>
                 <w:rFonts w:ascii="Hind Siliguri" w:hAnsi="Hind Siliguri" w:cs="Hind Siliguri"/>
-                <w:sz w:val="16"/>
-                <w:szCs w:val="16"/>
+                <w:sz w:val="20"/>
+                <w:szCs w:val="20"/>
               </w:rPr>
             </w:pPr>
             <w:r>
               <w:rPr>
                 <w:rFonts w:ascii="Hind Siliguri" w:hAnsi="Hind Siliguri" w:cs="Hind Siliguri"/>
                 <w:b/>
-                <w:color w:val="0369A1"/>
-                <w:sz w:val="16"/>
-                <w:szCs w:val="16"/>
+                <w:color w:val="8064A2" w:themeColor="accent4"/>
+                <w:sz w:val="20"/>
+                <w:szCs w:val="20"/>
               </w:rPr>
               <w:t>ডেলিভারি তারিখ:</w:t>
             </w:r>
@@ -675,7 +762,7 @@
         </w:tc>
         <w:tc>
           <w:tcPr>
-            <w:tcW w:w="2155" w:type="dxa"/>
+            <w:tcW w:w="2355" w:type="dxa"/>
             <w:tcBorders>
               <w:top w:val="single" w:sz="4" w:space="0" w:color="CBD5E1"/>
               <w:left w:val="single" w:sz="4" w:space="0" w:color="CBD5E1"/>
@@ -695,19 +782,31 @@
               <w:spacing w:after="0" w:line="240" w:lineRule="auto"/>
               <w:rPr>
                 <w:rFonts w:ascii="Hind Siliguri" w:hAnsi="Hind Siliguri" w:cs="Hind Siliguri"/>
-                <w:sz w:val="16"/>
-                <w:szCs w:val="16"/>
+                <w:sz w:val="20"/>
+                <w:szCs w:val="20"/>
               </w:rPr>
             </w:pPr>
+            <w:proofErr w:type="spellStart"/>
             <w:r>
               <w:rPr>
                 <w:rFonts w:ascii="Hind Siliguri" w:hAnsi="Hind Siliguri" w:cs="Hind Siliguri"/>
                 <w:b/>
-                <w:color w:val="0369A1"/>
-                <w:sz w:val="16"/>
-                <w:szCs w:val="16"/>
-              </w:rPr>
-              <w:t>কোম্পানী:</w:t>
+                <w:color w:val="8064A2" w:themeColor="accent4"/>
+                <w:sz w:val="20"/>
+                <w:szCs w:val="20"/>
+              </w:rPr>
+              <w:t>কোম্পানী</w:t>
+            </w:r>
+            <w:proofErr w:type="spellEnd"/>
+            <w:r>
+              <w:rPr>
+                <w:rFonts w:ascii="Hind Siliguri" w:hAnsi="Hind Siliguri" w:cs="Hind Siliguri"/>
+                <w:b/>
+                <w:color w:val="8064A2" w:themeColor="accent4"/>
+                <w:sz w:val="20"/>
+                <w:szCs w:val="20"/>
+              </w:rPr>
+              <w:t>:</w:t>
             </w:r>
           </w:p>
         </w:tc>
@@ -733,19 +832,53 @@
               <w:spacing w:after="0" w:line="240" w:lineRule="auto"/>
               <w:rPr>
                 <w:rFonts w:ascii="Hind Siliguri" w:hAnsi="Hind Siliguri" w:cs="Hind Siliguri"/>
-                <w:sz w:val="16"/>
-                <w:szCs w:val="16"/>
+                <w:sz w:val="20"/>
+                <w:szCs w:val="20"/>
               </w:rPr>
             </w:pPr>
+            <w:proofErr w:type="spellStart"/>
             <w:r>
               <w:rPr>
                 <w:rFonts w:ascii="Hind Siliguri" w:hAnsi="Hind Siliguri" w:cs="Hind Siliguri"/>
                 <w:b/>
-                <w:color w:val="0369A1"/>
-                <w:sz w:val="16"/>
-                <w:szCs w:val="16"/>
-              </w:rPr>
-              <w:t>আগমন বন্দর / ডিপো:</w:t>
+                <w:color w:val="8064A2" w:themeColor="accent4"/>
+                <w:sz w:val="20"/>
+                <w:szCs w:val="20"/>
+              </w:rPr>
+              <w:t>সাপ্লায়ার</w:t>
+            </w:r>
+            <w:proofErr w:type="spellEnd"/>
+            <w:r>
+              <w:rPr>
+                <w:rFonts w:ascii="Hind Siliguri" w:hAnsi="Hind Siliguri" w:cs="Hind Siliguri"/>
+                <w:b/>
+                <w:color w:val="8064A2" w:themeColor="accent4"/>
+                <w:sz w:val="20"/>
+                <w:szCs w:val="20"/>
+              </w:rPr>
+              <w:t xml:space="preserve"> </w:t>
+            </w:r>
+            <w:proofErr w:type="spellStart"/>
+            <w:r>
+              <w:rPr>
+                <w:rFonts w:ascii="Hind Siliguri" w:hAnsi="Hind Siliguri" w:cs="Hind Siliguri"/>
+                <w:b/>
+                <w:color w:val="8064A2" w:themeColor="accent4"/>
+                <w:sz w:val="20"/>
+                <w:szCs w:val="20"/>
+              </w:rPr>
+              <w:t>নাম</w:t>
+            </w:r>
+            <w:proofErr w:type="spellEnd"/>
+            <w:r>
+              <w:rPr>
+                <w:rFonts w:ascii="Hind Siliguri" w:hAnsi="Hind Siliguri" w:cs="Hind Siliguri"/>
+                <w:b/>
+                <w:color w:val="8064A2" w:themeColor="accent4"/>
+                <w:sz w:val="20"/>
+                <w:szCs w:val="20"/>
+              </w:rPr>
+              <w:t>:</w:t>
             </w:r>
           </w:p>
         </w:tc>
@@ -758,47 +891,328 @@
           <w:rFonts w:ascii="Hind Siliguri" w:hAnsi="Hind Siliguri" w:cs="Hind Siliguri"/>
         </w:rPr>
       </w:pPr>
+      <w:r>
+        <w:rPr>
+          <w:noProof/>
+          <w:sz w:val="28"/>
+          <w:szCs w:val="28"/>
+        </w:rPr>
+        <mc:AlternateContent>
+          <mc:Choice Requires="wps">
+            <w:drawing>
+              <wp:anchor distT="0" distB="0" distL="114300" distR="114300" simplePos="0" relativeHeight="251659776" behindDoc="0" locked="0" layoutInCell="1" allowOverlap="1" wp14:anchorId="398C4359" wp14:editId="2446C901">
+                <wp:simplePos x="0" y="0"/>
+                <wp:positionH relativeFrom="column">
+                  <wp:posOffset>4516120</wp:posOffset>
+                </wp:positionH>
+                <wp:positionV relativeFrom="paragraph">
+                  <wp:posOffset>190500</wp:posOffset>
+                </wp:positionV>
+                <wp:extent cx="2540000" cy="1828800"/>
+                <wp:effectExtent l="0" t="0" r="0" b="6350"/>
+                <wp:wrapNone/>
+                <wp:docPr id="686045004" name="Text Box 1"/>
+                <wp:cNvGraphicFramePr/>
+                <a:graphic xmlns:a="http://schemas.openxmlformats.org/drawingml/2006/main">
+                  <a:graphicData uri="http://schemas.microsoft.com/office/word/2010/wordprocessingShape">
+                    <wps:wsp>
+                      <wps:cNvSpPr txBox="1"/>
+                      <wps:spPr>
+                        <a:xfrm>
+                          <a:off x="0" y="0"/>
+                          <a:ext cx="2540000" cy="1828800"/>
+                        </a:xfrm>
+                        <a:prstGeom prst="rect">
+                          <a:avLst/>
+                        </a:prstGeom>
+                        <a:noFill/>
+                        <a:ln>
+                          <a:noFill/>
+                        </a:ln>
+                      </wps:spPr>
+                      <wps:txbx>
+                        <w:txbxContent>
+                          <w:p>
+                            <w:pPr>
+                              <w:tabs>
+                                <w:tab w:val="left" w:pos="8360"/>
+                              </w:tabs>
+                              <w:spacing w:after="60" w:line="240" w:lineRule="auto"/>
+                              <w:jc w:val="center"/>
+                              <w:rPr>
+                                <w:rFonts w:ascii="Hind Siliguri" w:hAnsi="Hind Siliguri" w:cs="Hind Siliguri"/>
+                                <w:color w:val="000000" w:themeColor="text1"/>
+                                <w:sz w:val="72"/>
+                                <w:szCs w:val="72"/>
+                                <w14:shadow w14:blurRad="38100" w14:dist="19050" w14:dir="2700000" w14:sx="100000" w14:sy="100000" w14:kx="0" w14:ky="0" w14:algn="tl">
+                                  <w14:schemeClr w14:val="dk1">
+                                    <w14:alpha w14:val="60000"/>
+                                  </w14:schemeClr>
+                                </w14:shadow>
+                                <w14:textOutline w14:w="0" w14:cap="flat" w14:cmpd="sng" w14:algn="ctr">
+                                  <w14:noFill/>
+                                  <w14:prstDash w14:val="solid"/>
+                                  <w14:round/>
+                                </w14:textOutline>
+                              </w:rPr>
+                            </w:pPr>
+                            <w:proofErr w:type="spellStart"/>
+                            <w:r>
+                              <w:rPr>
+                                <w:rFonts w:ascii="Hind Siliguri" w:hAnsi="Hind Siliguri" w:cs="Hind Siliguri"/>
+                                <w:b/>
+                                <w:bCs/>
+                              </w:rPr>
+                              <w:t>কন্টেইনার</w:t>
+                            </w:r>
+                            <w:proofErr w:type="spellEnd"/>
+                            <w:r>
+                              <w:rPr>
+                                <w:rFonts w:ascii="Hind Siliguri" w:hAnsi="Hind Siliguri" w:cs="Hind Siliguri"/>
+                                <w:b/>
+                                <w:bCs/>
+                              </w:rPr>
+                              <w:t xml:space="preserve"> </w:t>
+                            </w:r>
+                            <w:proofErr w:type="spellStart"/>
+                            <w:r>
+                              <w:rPr>
+                                <w:rFonts w:ascii="Hind Siliguri" w:hAnsi="Hind Siliguri" w:cs="Hind Siliguri"/>
+                                <w:b/>
+                                <w:bCs/>
+                              </w:rPr>
+                              <w:t>সিরিয়াল</w:t>
+                            </w:r>
+                            <w:proofErr w:type="spellEnd"/>
+                            <w:r>
+                              <w:rPr>
+                                <w:rFonts w:ascii="Hind Siliguri" w:hAnsi="Hind Siliguri" w:cs="Hind Siliguri"/>
+                                <w:b/>
+                                <w:bCs/>
+                              </w:rPr>
+                              <w:t>:</w:t>
+                            </w:r>
+                            <w:r>
+                              <w:rPr>
+                                <w:rFonts w:ascii="Hind Siliguri" w:hAnsi="Hind Siliguri" w:cs="Hind Siliguri"/>
+                              </w:rPr>
+                              <w:t xml:space="preserve"> ২০</w:t>
+                            </w:r>
+                            <w:r>
+                              <w:rPr>
+                                <w:rFonts w:ascii="Hind Siliguri" w:hAnsi="Hind Siliguri" w:cs="Hind Siliguri"/>
+                              </w:rPr>
+                              <w:t>…</w:t>
+                            </w:r>
+                            <w:r>
+                              <w:rPr>
+                                <w:rFonts w:ascii="Hind Siliguri" w:hAnsi="Hind Siliguri" w:cs="Hind Siliguri"/>
+                              </w:rPr>
+                              <w:t>…</w:t>
+                            </w:r>
+                            <w:r>
+                              <w:rPr>
+                                <w:rFonts w:ascii="Hind Siliguri" w:hAnsi="Hind Siliguri" w:cs="Hind Siliguri"/>
+                              </w:rPr>
+                              <w:t>……</w:t>
+                            </w:r>
+                            <w:r>
+                              <w:rPr>
+                                <w:rFonts w:ascii="Hind Siliguri" w:hAnsi="Hind Siliguri" w:cs="Hind Siliguri"/>
+                              </w:rPr>
+                              <w:t xml:space="preserve"> </w:t>
+                            </w:r>
+                            <w:proofErr w:type="spellStart"/>
+                            <w:r>
+                              <w:rPr>
+                                <w:rFonts w:ascii="Hind Siliguri" w:hAnsi="Hind Siliguri" w:cs="Hind Siliguri"/>
+                              </w:rPr>
+                              <w:t>নং</w:t>
+                            </w:r>
+                            <w:proofErr w:type="spellEnd"/>
+                            <w:r>
+                              <w:rPr>
+                                <w:rFonts w:ascii="Hind Siliguri" w:hAnsi="Hind Siliguri" w:cs="Hind Siliguri"/>
+                              </w:rPr>
+                              <w:t xml:space="preserve"> …………</w:t>
+                            </w:r>
+                          </w:p>
+                        </w:txbxContent>
+                      </wps:txbx>
+                      <wps:bodyPr rot="0" spcFirstLastPara="0" vertOverflow="overflow" horzOverflow="overflow" vert="horz" wrap="square" lIns="91440" tIns="45720" rIns="91440" bIns="45720" numCol="1" spcCol="0" rtlCol="0" fromWordArt="0" anchor="t" anchorCtr="0" forceAA="0" compatLnSpc="1">
+                        <a:prstTxWarp prst="textNoShape">
+                          <a:avLst/>
+                        </a:prstTxWarp>
+                        <a:spAutoFit/>
+                      </wps:bodyPr>
+                    </wps:wsp>
+                  </a:graphicData>
+                </a:graphic>
+                <wp14:sizeRelH relativeFrom="margin">
+                  <wp14:pctWidth>0</wp14:pctWidth>
+                </wp14:sizeRelH>
+              </wp:anchor>
+            </w:drawing>
+          </mc:Choice>
+          <mc:Fallback>
+            <w:pict>
+              <v:shapetype w14:anchorId="398C4359" id="_x0000_t202" coordsize="21600,21600" o:spt="202" path="m,l,21600r21600,l21600,xe">
+                <v:stroke joinstyle="miter"/>
+                <v:path gradientshapeok="t" o:connecttype="rect"/>
+              </v:shapetype>
+              <v:shape id="Text Box 1" o:spid="_x0000_s1026" type="#_x0000_t202" style="position:absolute;margin-left:355.6pt;margin-top:15pt;width:200pt;height:2in;z-index:251659776;visibility:visible;mso-wrap-style:square;mso-width-percent:0;mso-wrap-distance-left:9pt;mso-wrap-distance-top:0;mso-wrap-distance-right:9pt;mso-wrap-distance-bottom:0;mso-position-horizontal:absolute;mso-position-horizontal-relative:text;mso-position-vertical:absolute;mso-position-vertical-relative:text;mso-width-percent:0;mso-width-relative:margin;v-text-anchor:top" o:gfxdata="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" filled="f" stroked="f">
+                <v:fill o:detectmouseclick="t"/>
+                <v:textbox style="mso-fit-shape-to-text:t">
+                  <w:txbxContent>
+                    <w:p>
+                      <w:pPr>
+                        <w:tabs>
+                          <w:tab w:val="left" w:pos="8360"/>
+                        </w:tabs>
+                        <w:spacing w:after="60" w:line="240" w:lineRule="auto"/>
+                        <w:jc w:val="center"/>
+                        <w:rPr>
+                          <w:rFonts w:ascii="Hind Siliguri" w:hAnsi="Hind Siliguri" w:cs="Hind Siliguri"/>
+                          <w:color w:val="000000" w:themeColor="text1"/>
+                          <w:sz w:val="72"/>
+                          <w:szCs w:val="72"/>
+                          <w14:shadow w14:blurRad="38100" w14:dist="19050" w14:dir="2700000" w14:sx="100000" w14:sy="100000" w14:kx="0" w14:ky="0" w14:algn="tl">
+                            <w14:schemeClr w14:val="dk1">
+                              <w14:alpha w14:val="60000"/>
+                            </w14:schemeClr>
+                          </w14:shadow>
+                          <w14:textOutline w14:w="0" w14:cap="flat" w14:cmpd="sng" w14:algn="ctr">
+                            <w14:noFill/>
+                            <w14:prstDash w14:val="solid"/>
+                            <w14:round/>
+                          </w14:textOutline>
+                        </w:rPr>
+                      </w:pPr>
+                      <w:proofErr w:type="spellStart"/>
+                      <w:r>
+                        <w:rPr>
+                          <w:rFonts w:ascii="Hind Siliguri" w:hAnsi="Hind Siliguri" w:cs="Hind Siliguri"/>
+                          <w:b/>
+                          <w:bCs/>
+                        </w:rPr>
+                        <w:t>কন্টেইনার</w:t>
+                      </w:r>
+                      <w:proofErr w:type="spellEnd"/>
+                      <w:r>
+                        <w:rPr>
+                          <w:rFonts w:ascii="Hind Siliguri" w:hAnsi="Hind Siliguri" w:cs="Hind Siliguri"/>
+                          <w:b/>
+                          <w:bCs/>
+                        </w:rPr>
+                        <w:t xml:space="preserve"> </w:t>
+                      </w:r>
+                      <w:proofErr w:type="spellStart"/>
+                      <w:r>
+                        <w:rPr>
+                          <w:rFonts w:ascii="Hind Siliguri" w:hAnsi="Hind Siliguri" w:cs="Hind Siliguri"/>
+                          <w:b/>
+                          <w:bCs/>
+                        </w:rPr>
+                        <w:t>সিরিয়াল</w:t>
+                      </w:r>
+                      <w:proofErr w:type="spellEnd"/>
+                      <w:r>
+                        <w:rPr>
+                          <w:rFonts w:ascii="Hind Siliguri" w:hAnsi="Hind Siliguri" w:cs="Hind Siliguri"/>
+                          <w:b/>
+                          <w:bCs/>
+                        </w:rPr>
+                        <w:t>:</w:t>
+                      </w:r>
+                      <w:r>
+                        <w:rPr>
+                          <w:rFonts w:ascii="Hind Siliguri" w:hAnsi="Hind Siliguri" w:cs="Hind Siliguri"/>
+                        </w:rPr>
+                        <w:t xml:space="preserve"> ২০</w:t>
+                      </w:r>
+                      <w:r>
+                        <w:rPr>
+                          <w:rFonts w:ascii="Hind Siliguri" w:hAnsi="Hind Siliguri" w:cs="Hind Siliguri"/>
+                        </w:rPr>
+                        <w:t>…</w:t>
+                      </w:r>
+                      <w:r>
+                        <w:rPr>
+                          <w:rFonts w:ascii="Hind Siliguri" w:hAnsi="Hind Siliguri" w:cs="Hind Siliguri"/>
+                        </w:rPr>
+                        <w:t>…</w:t>
+                      </w:r>
+                      <w:r>
+                        <w:rPr>
+                          <w:rFonts w:ascii="Hind Siliguri" w:hAnsi="Hind Siliguri" w:cs="Hind Siliguri"/>
+                        </w:rPr>
+                        <w:t>……</w:t>
+                      </w:r>
+                      <w:r>
+                        <w:rPr>
+                          <w:rFonts w:ascii="Hind Siliguri" w:hAnsi="Hind Siliguri" w:cs="Hind Siliguri"/>
+                        </w:rPr>
+                        <w:t xml:space="preserve"> </w:t>
+                      </w:r>
+                      <w:proofErr w:type="spellStart"/>
+                      <w:r>
+                        <w:rPr>
+                          <w:rFonts w:ascii="Hind Siliguri" w:hAnsi="Hind Siliguri" w:cs="Hind Siliguri"/>
+                        </w:rPr>
+                        <w:t>নং</w:t>
+                      </w:r>
+                      <w:proofErr w:type="spellEnd"/>
+                      <w:r>
+                        <w:rPr>
+                          <w:rFonts w:ascii="Hind Siliguri" w:hAnsi="Hind Siliguri" w:cs="Hind Siliguri"/>
+                        </w:rPr>
+                        <w:t xml:space="preserve"> …………</w:t>
+                      </w:r>
+                    </w:p>
+                  </w:txbxContent>
+                </v:textbox>
+              </v:shape>
+            </w:pict>
+          </mc:Fallback>
+        </mc:AlternateContent>
+      </w:r>
+    </w:p>
+    <w:p>
+      <w:pPr>
+        <w:spacing w:after="60"/>
+        <w:rPr>
+          <w:rFonts w:ascii="Hind Siliguri" w:hAnsi="Hind Siliguri" w:cs="Hind Siliguri"/>
+        </w:rPr>
+      </w:pPr>
     </w:p>
     <w:tbl>
       <w:tblPr>
-        <w:tblW w:w="10684" w:type="dxa"/>
-        <w:jc w:val="center"/>
+        <w:tblStyle w:val="TableGrid"/>
+        <w:tblW w:w="11160" w:type="dxa"/>
+        <w:tblInd w:w="-162" w:type="dxa"/>
         <w:tblLayout w:type="fixed"/>
         <w:tblLook w:val="04A0" w:firstRow="1" w:lastRow="0" w:firstColumn="1" w:lastColumn="0" w:noHBand="0" w:noVBand="1"/>
       </w:tblPr>
       <w:tblGrid>
-        <w:gridCol w:w="576"/>
-        <w:gridCol w:w="6871"/>
-        <w:gridCol w:w="3237"/>
+        <w:gridCol w:w="810"/>
+        <w:gridCol w:w="8010"/>
+        <w:gridCol w:w="2340"/>
       </w:tblGrid>
       <w:tr>
         <w:trPr>
-          <w:trHeight w:val="268"/>
-          <w:jc w:val="center"/>
+          <w:trHeight w:val="358"/>
         </w:trPr>
         <w:tc>
           <w:tcPr>
-            <w:tcW w:w="576" w:type="dxa"/>
-            <w:tcBorders>
-              <w:top w:val="single" w:sz="6" w:space="0" w:color="0369A1"/>
-              <w:left w:val="single" w:sz="6" w:space="0" w:color="CBD5E1"/>
-              <w:bottom w:val="single" w:sz="6" w:space="0" w:color="0369A1"/>
-              <w:right w:val="single" w:sz="6" w:space="0" w:color="CBD5E1"/>
-            </w:tcBorders>
-            <w:shd w:val="clear" w:color="auto" w:fill="E0F2FE"/>
-            <w:tcMar>
-              <w:top w:w="70" w:type="dxa"/>
-              <w:left w:w="80" w:type="dxa"/>
-              <w:bottom w:w="70" w:type="dxa"/>
-              <w:right w:w="80" w:type="dxa"/>
-            </w:tcMar>
+            <w:tcW w:w="810" w:type="dxa"/>
           </w:tcPr>
           <w:p>
             <w:pPr>
-              <w:spacing w:after="0"/>
               <w:jc w:val="center"/>
               <w:rPr>
                 <w:rFonts w:ascii="Hind Siliguri" w:hAnsi="Hind Siliguri" w:cs="Hind Siliguri"/>
+                <w:sz w:val="28"/>
+                <w:szCs w:val="28"/>
               </w:rPr>
             </w:pPr>
             <w:proofErr w:type="spellStart"/>
@@ -807,7 +1221,8 @@
                 <w:rFonts w:ascii="Hind Siliguri" w:hAnsi="Hind Siliguri" w:cs="Hind Siliguri"/>
                 <w:b/>
                 <w:color w:val="0369A1"/>
-                <w:sz w:val="17"/>
+                <w:sz w:val="28"/>
+                <w:szCs w:val="28"/>
               </w:rPr>
               <w:t>ক্র</w:t>
             </w:r>
@@ -817,7 +1232,8 @@
                 <w:rFonts w:ascii="Hind Siliguri" w:hAnsi="Hind Siliguri" w:cs="Hind Siliguri"/>
                 <w:b/>
                 <w:color w:val="0369A1"/>
-                <w:sz w:val="17"/>
+                <w:sz w:val="28"/>
+                <w:szCs w:val="28"/>
               </w:rPr>
               <w:t>.</w:t>
             </w:r>
@@ -825,27 +1241,15 @@
         </w:tc>
         <w:tc>
           <w:tcPr>
-            <w:tcW w:w="6871" w:type="dxa"/>
-            <w:tcBorders>
-              <w:top w:val="single" w:sz="6" w:space="0" w:color="0369A1"/>
-              <w:left w:val="single" w:sz="6" w:space="0" w:color="CBD5E1"/>
-              <w:bottom w:val="single" w:sz="6" w:space="0" w:color="0369A1"/>
-              <w:right w:val="single" w:sz="6" w:space="0" w:color="CBD5E1"/>
-            </w:tcBorders>
-            <w:shd w:val="clear" w:color="auto" w:fill="E0F2FE"/>
-            <w:tcMar>
-              <w:top w:w="70" w:type="dxa"/>
-              <w:left w:w="80" w:type="dxa"/>
-              <w:bottom w:w="70" w:type="dxa"/>
-              <w:right w:w="80" w:type="dxa"/>
-            </w:tcMar>
+            <w:tcW w:w="8010" w:type="dxa"/>
           </w:tcPr>
           <w:p>
             <w:pPr>
-              <w:spacing w:after="0"/>
               <w:jc w:val="center"/>
               <w:rPr>
                 <w:rFonts w:ascii="Hind Siliguri" w:hAnsi="Hind Siliguri" w:cs="Hind Siliguri"/>
+                <w:sz w:val="28"/>
+                <w:szCs w:val="28"/>
               </w:rPr>
             </w:pPr>
             <w:r>
@@ -853,7 +1257,8 @@
                 <w:rFonts w:ascii="Hind Siliguri" w:hAnsi="Hind Siliguri" w:cs="Hind Siliguri"/>
                 <w:b/>
                 <w:color w:val="0369A1"/>
-                <w:sz w:val="17"/>
+                <w:sz w:val="28"/>
+                <w:szCs w:val="28"/>
               </w:rPr>
               <w:t>খরচের খাত ও কাজের বিবরণ (Expense Particulars)</w:t>
             </w:r>
@@ -861,69 +1266,79 @@
         </w:tc>
         <w:tc>
           <w:tcPr>
-            <w:tcW w:w="3237" w:type="dxa"/>
-            <w:tcBorders>
-              <w:top w:val="single" w:sz="6" w:space="0" w:color="0369A1"/>
-              <w:left w:val="single" w:sz="6" w:space="0" w:color="CBD5E1"/>
-              <w:bottom w:val="single" w:sz="6" w:space="0" w:color="0369A1"/>
-              <w:right w:val="single" w:sz="6" w:space="0" w:color="CBD5E1"/>
-            </w:tcBorders>
-            <w:shd w:val="clear" w:color="auto" w:fill="E0F2FE"/>
-            <w:tcMar>
-              <w:top w:w="70" w:type="dxa"/>
-              <w:left w:w="80" w:type="dxa"/>
-              <w:bottom w:w="70" w:type="dxa"/>
-              <w:right w:w="80" w:type="dxa"/>
-            </w:tcMar>
+            <w:tcW w:w="2340" w:type="dxa"/>
           </w:tcPr>
           <w:p>
             <w:pPr>
-              <w:spacing w:after="0"/>
               <w:jc w:val="center"/>
               <w:rPr>
                 <w:rFonts w:ascii="Hind Siliguri" w:hAnsi="Hind Siliguri" w:cs="Hind Siliguri"/>
+                <w:sz w:val="28"/>
+                <w:szCs w:val="28"/>
               </w:rPr>
             </w:pPr>
+            <w:proofErr w:type="spellStart"/>
             <w:r>
               <w:rPr>
                 <w:rFonts w:ascii="Hind Siliguri" w:hAnsi="Hind Siliguri" w:cs="Hind Siliguri"/>
                 <w:b/>
                 <w:color w:val="0369A1"/>
-                <w:sz w:val="17"/>
-              </w:rPr>
-              <w:t>পরিমাণ (টাকা)</w:t>
+                <w:sz w:val="28"/>
+                <w:szCs w:val="28"/>
+              </w:rPr>
+              <w:t>পরিমাণ</w:t>
+            </w:r>
+            <w:proofErr w:type="spellEnd"/>
+            <w:r>
+              <w:rPr>
+                <w:rFonts w:ascii="Hind Siliguri" w:hAnsi="Hind Siliguri" w:cs="Hind Siliguri"/>
+                <w:b/>
+                <w:color w:val="0369A1"/>
+                <w:sz w:val="28"/>
+                <w:szCs w:val="28"/>
+              </w:rPr>
+              <w:t xml:space="preserve"> (</w:t>
+            </w:r>
+            <w:proofErr w:type="spellStart"/>
+            <w:r>
+              <w:rPr>
+                <w:rFonts w:ascii="Hind Siliguri" w:hAnsi="Hind Siliguri" w:cs="Hind Siliguri"/>
+                <w:b/>
+                <w:color w:val="0369A1"/>
+                <w:sz w:val="28"/>
+                <w:szCs w:val="28"/>
+              </w:rPr>
+              <w:t>টাকা</w:t>
+            </w:r>
+            <w:proofErr w:type="spellEnd"/>
+            <w:r>
+              <w:rPr>
+                <w:rFonts w:ascii="Hind Siliguri" w:hAnsi="Hind Siliguri" w:cs="Hind Siliguri"/>
+                <w:b/>
+                <w:color w:val="0369A1"/>
+                <w:sz w:val="28"/>
+                <w:szCs w:val="28"/>
+              </w:rPr>
+              <w:t>)</w:t>
             </w:r>
           </w:p>
         </w:tc>
       </w:tr>
       <w:tr>
         <w:trPr>
-          <w:trHeight w:val="346"/>
-          <w:jc w:val="center"/>
+          <w:trHeight w:val="463"/>
         </w:trPr>
         <w:tc>
           <w:tcPr>
-            <w:tcW w:w="576" w:type="dxa"/>
-            <w:tcBorders>
-              <w:top w:val="single" w:sz="4" w:space="0" w:color="CBD5E1"/>
-              <w:left w:val="single" w:sz="4" w:space="0" w:color="CBD5E1"/>
-              <w:bottom w:val="single" w:sz="4" w:space="0" w:color="CBD5E1"/>
-              <w:right w:val="single" w:sz="4" w:space="0" w:color="CBD5E1"/>
-            </w:tcBorders>
-            <w:shd w:val="clear" w:color="auto" w:fill="FFFFFF"/>
-            <w:tcMar>
-              <w:top w:w="45" w:type="dxa"/>
-              <w:left w:w="40" w:type="dxa"/>
-              <w:bottom w:w="45" w:type="dxa"/>
-              <w:right w:w="40" w:type="dxa"/>
-            </w:tcMar>
+            <w:tcW w:w="810" w:type="dxa"/>
           </w:tcPr>
           <w:p>
             <w:pPr>
-              <w:spacing w:after="0"/>
               <w:jc w:val="center"/>
               <w:rPr>
                 <w:rFonts w:ascii="Hind Siliguri" w:hAnsi="Hind Siliguri" w:cs="Hind Siliguri"/>
+                <w:sz w:val="28"/>
+                <w:szCs w:val="28"/>
               </w:rPr>
             </w:pPr>
             <w:r>
@@ -931,7 +1346,8 @@
                 <w:rFonts w:ascii="Hind Siliguri" w:hAnsi="Hind Siliguri" w:cs="Hind Siliguri"/>
                 <w:b/>
                 <w:color w:val="0369A1"/>
-                <w:sz w:val="16"/>
+                <w:sz w:val="28"/>
+                <w:szCs w:val="28"/>
               </w:rPr>
               <w:t>১</w:t>
             </w:r>
@@ -939,61 +1355,197 @@
         </w:tc>
         <w:tc>
           <w:tcPr>
-            <w:tcW w:w="6871" w:type="dxa"/>
-            <w:tcBorders>
-              <w:top w:val="single" w:sz="4" w:space="0" w:color="CBD5E1"/>
-              <w:left w:val="single" w:sz="4" w:space="0" w:color="CBD5E1"/>
-              <w:bottom w:val="single" w:sz="4" w:space="0" w:color="CBD5E1"/>
-              <w:right w:val="single" w:sz="4" w:space="0" w:color="CBD5E1"/>
-            </w:tcBorders>
-            <w:shd w:val="clear" w:color="auto" w:fill="FFFFFF"/>
-            <w:tcMar>
-              <w:top w:w="45" w:type="dxa"/>
-              <w:left w:w="80" w:type="dxa"/>
-              <w:bottom w:w="45" w:type="dxa"/>
-              <w:right w:w="80" w:type="dxa"/>
-            </w:tcMar>
+            <w:tcW w:w="8010" w:type="dxa"/>
           </w:tcPr>
           <w:p>
             <w:pPr>
-              <w:spacing w:after="0"/>
-              <w:rPr>
-                <w:rFonts w:ascii="Hind Siliguri" w:hAnsi="Hind Siliguri" w:cs="Hind Siliguri"/>
+              <w:rPr>
+                <w:rFonts w:ascii="Hind Siliguri" w:hAnsi="Hind Siliguri" w:cs="Hind Siliguri"/>
+                <w:color w:val="1E293B"/>
+                <w:sz w:val="28"/>
+                <w:szCs w:val="28"/>
               </w:rPr>
             </w:pPr>
             <w:r>
               <w:rPr>
                 <w:rFonts w:ascii="Hind Siliguri" w:hAnsi="Hind Siliguri" w:cs="Hind Siliguri"/>
                 <w:color w:val="1E293B"/>
-                <w:sz w:val="16"/>
-              </w:rPr>
-              <w:t>UAE প্রাথমিক খরচ (বকশিশ, চা-নাস্তা, স্কেল / রুম ভাড়া/খাওয়া:  AED=</w:t>
+                <w:sz w:val="28"/>
+                <w:szCs w:val="28"/>
+              </w:rPr>
+              <w:t xml:space="preserve">UAE প্রাথমিক খরচ (বকশিশ, চা-নাস্তা, স্কেল / রুম ভাড়া/খাওয়া:  </w:t>
+            </w:r>
+          </w:p>
+          <w:p>
+            <w:pPr>
+              <w:rPr>
+                <w:rFonts w:ascii="Hind Siliguri" w:hAnsi="Hind Siliguri" w:cs="Hind Siliguri"/>
+                <w:sz w:val="28"/>
+                <w:szCs w:val="28"/>
+              </w:rPr>
+            </w:pPr>
+            <w:r>
+              <w:rPr>
+                <w:rFonts w:ascii="Hind Siliguri" w:hAnsi="Hind Siliguri" w:cs="Hind Siliguri"/>
+                <w:color w:val="1E293B"/>
+                <w:sz w:val="28"/>
+                <w:szCs w:val="28"/>
+              </w:rPr>
+              <w:t xml:space="preserve">                                                                                 </w:t>
+            </w:r>
+            <w:r>
+              <w:rPr>
+                <w:rFonts w:ascii="Hind Siliguri" w:hAnsi="Hind Siliguri" w:cs="Hind Siliguri"/>
+                <w:color w:val="1E293B"/>
+                <w:sz w:val="28"/>
+                <w:szCs w:val="28"/>
+              </w:rPr>
+              <w:t>AED=</w:t>
             </w:r>
           </w:p>
         </w:tc>
         <w:tc>
           <w:tcPr>
-            <w:tcW w:w="3237" w:type="dxa"/>
-            <w:tcBorders>
-              <w:top w:val="single" w:sz="4" w:space="0" w:color="CBD5E1"/>
-              <w:left w:val="single" w:sz="4" w:space="0" w:color="CBD5E1"/>
-              <w:bottom w:val="single" w:sz="4" w:space="0" w:color="CBD5E1"/>
-              <w:right w:val="single" w:sz="4" w:space="0" w:color="CBD5E1"/>
-            </w:tcBorders>
-            <w:shd w:val="clear" w:color="auto" w:fill="FFFFFF"/>
-            <w:tcMar>
-              <w:top w:w="45" w:type="dxa"/>
-              <w:left w:w="60" w:type="dxa"/>
-              <w:bottom w:w="45" w:type="dxa"/>
-              <w:right w:w="60" w:type="dxa"/>
-            </w:tcMar>
+            <w:tcW w:w="2340" w:type="dxa"/>
           </w:tcPr>
           <w:p>
             <w:pPr>
-              <w:spacing w:after="0"/>
               <w:jc w:val="right"/>
               <w:rPr>
                 <w:rFonts w:ascii="Hind Siliguri" w:hAnsi="Hind Siliguri" w:cs="Hind Siliguri"/>
+                <w:sz w:val="28"/>
+                <w:szCs w:val="28"/>
+              </w:rPr>
+            </w:pPr>
+            <w:r>
+              <w:rPr>
+                <w:rFonts w:ascii="Hind Siliguri" w:hAnsi="Hind Siliguri" w:cs="Hind Siliguri"/>
+                <w:sz w:val="28"/>
+                <w:szCs w:val="28"/>
+              </w:rPr>
+              <w:t xml:space="preserve">     </w:t>
+            </w:r>
+          </w:p>
+        </w:tc>
+      </w:tr>
+      <w:tr>
+        <w:trPr>
+          <w:trHeight w:val="463"/>
+        </w:trPr>
+        <w:tc>
+          <w:tcPr>
+            <w:tcW w:w="810" w:type="dxa"/>
+          </w:tcPr>
+          <w:p>
+            <w:pPr>
+              <w:jc w:val="center"/>
+              <w:rPr>
+                <w:rFonts w:ascii="Hind Siliguri" w:hAnsi="Hind Siliguri" w:cs="Hind Siliguri"/>
+                <w:sz w:val="28"/>
+                <w:szCs w:val="28"/>
+              </w:rPr>
+            </w:pPr>
+            <w:r>
+              <w:rPr>
+                <w:rFonts w:ascii="Hind Siliguri" w:hAnsi="Hind Siliguri" w:cs="Hind Siliguri"/>
+                <w:b/>
+                <w:color w:val="0369A1"/>
+                <w:sz w:val="28"/>
+                <w:szCs w:val="28"/>
+              </w:rPr>
+              <w:t>২</w:t>
+            </w:r>
+          </w:p>
+        </w:tc>
+        <w:tc>
+          <w:tcPr>
+            <w:tcW w:w="8010" w:type="dxa"/>
+          </w:tcPr>
+          <w:p>
+            <w:pPr>
+              <w:rPr>
+                <w:rFonts w:ascii="Nirmala UI" w:hAnsi="Nirmala UI" w:cs="Nirmala UI"/>
+                <w:sz w:val="28"/>
+                <w:szCs w:val="28"/>
+              </w:rPr>
+            </w:pPr>
+            <w:proofErr w:type="spellStart"/>
+            <w:r>
+              <w:rPr>
+                <w:rFonts w:ascii="Hind Siliguri" w:hAnsi="Hind Siliguri" w:cs="Hind Siliguri"/>
+                <w:sz w:val="28"/>
+                <w:szCs w:val="28"/>
+              </w:rPr>
+              <w:t>কন্টেইনার</w:t>
+            </w:r>
+            <w:proofErr w:type="spellEnd"/>
+            <w:r>
+              <w:rPr>
+                <w:rFonts w:ascii="Hind Siliguri" w:hAnsi="Hind Siliguri" w:cs="Hind Siliguri"/>
+                <w:sz w:val="28"/>
+                <w:szCs w:val="28"/>
+              </w:rPr>
+              <w:t xml:space="preserve"> </w:t>
+            </w:r>
+            <w:proofErr w:type="spellStart"/>
+            <w:r>
+              <w:rPr>
+                <w:rFonts w:ascii="Hind Siliguri" w:hAnsi="Hind Siliguri" w:cs="Hind Siliguri"/>
+                <w:sz w:val="28"/>
+                <w:szCs w:val="28"/>
+              </w:rPr>
+              <w:t>লোডিং</w:t>
+            </w:r>
+            <w:proofErr w:type="spellEnd"/>
+            <w:r>
+              <w:rPr>
+                <w:rFonts w:ascii="Hind Siliguri" w:hAnsi="Hind Siliguri" w:cs="Hind Siliguri"/>
+                <w:sz w:val="28"/>
+                <w:szCs w:val="28"/>
+              </w:rPr>
+              <w:t xml:space="preserve"> </w:t>
+            </w:r>
+            <w:proofErr w:type="spellStart"/>
+            <w:r>
+              <w:rPr>
+                <w:rFonts w:ascii="Hind Siliguri" w:hAnsi="Hind Siliguri" w:cs="Hind Siliguri"/>
+                <w:sz w:val="28"/>
+                <w:szCs w:val="28"/>
+              </w:rPr>
+              <w:t>ইয়ার্ড</w:t>
+            </w:r>
+            <w:proofErr w:type="spellEnd"/>
+            <w:r>
+              <w:rPr>
+                <w:rFonts w:ascii="Hind Siliguri" w:hAnsi="Hind Siliguri" w:cs="Hind Siliguri"/>
+                <w:sz w:val="28"/>
+                <w:szCs w:val="28"/>
+              </w:rPr>
+              <w:t xml:space="preserve"> </w:t>
+            </w:r>
+            <w:proofErr w:type="spellStart"/>
+            <w:r>
+              <w:rPr>
+                <w:rFonts w:ascii="Hind Siliguri" w:hAnsi="Hind Siliguri" w:cs="Hind Siliguri"/>
+                <w:sz w:val="28"/>
+                <w:szCs w:val="28"/>
+              </w:rPr>
+              <w:t>ভাড়া</w:t>
+            </w:r>
+            <w:proofErr w:type="spellEnd"/>
+          </w:p>
+        </w:tc>
+        <w:tc>
+          <w:tcPr>
+            <w:tcW w:w="2340" w:type="dxa"/>
+          </w:tcPr>
+          <w:p>
+            <w:pPr>
+              <w:jc w:val="right"/>
+              <w:rPr>
+                <w:rFonts w:ascii="Hind Siliguri" w:hAnsi="Hind Siliguri" w:cs="Hind Siliguri"/>
+                <w:sz w:val="28"/>
+                <w:szCs w:val="28"/>
               </w:rPr>
             </w:pPr>
           </w:p>
@@ -1001,32 +1553,19 @@
       </w:tr>
       <w:tr>
         <w:trPr>
-          <w:trHeight w:val="346"/>
-          <w:jc w:val="center"/>
+          <w:trHeight w:val="463"/>
         </w:trPr>
         <w:tc>
           <w:tcPr>
-            <w:tcW w:w="576" w:type="dxa"/>
-            <w:tcBorders>
-              <w:top w:val="single" w:sz="4" w:space="0" w:color="CBD5E1"/>
-              <w:left w:val="single" w:sz="4" w:space="0" w:color="CBD5E1"/>
-              <w:bottom w:val="single" w:sz="4" w:space="0" w:color="CBD5E1"/>
-              <w:right w:val="single" w:sz="4" w:space="0" w:color="CBD5E1"/>
-            </w:tcBorders>
-            <w:shd w:val="clear" w:color="auto" w:fill="F8FAFC"/>
-            <w:tcMar>
-              <w:top w:w="45" w:type="dxa"/>
-              <w:left w:w="40" w:type="dxa"/>
-              <w:bottom w:w="45" w:type="dxa"/>
-              <w:right w:w="40" w:type="dxa"/>
-            </w:tcMar>
+            <w:tcW w:w="810" w:type="dxa"/>
           </w:tcPr>
           <w:p>
             <w:pPr>
-              <w:spacing w:after="0"/>
               <w:jc w:val="center"/>
               <w:rPr>
                 <w:rFonts w:ascii="Hind Siliguri" w:hAnsi="Hind Siliguri" w:cs="Hind Siliguri"/>
+                <w:sz w:val="28"/>
+                <w:szCs w:val="28"/>
               </w:rPr>
             </w:pPr>
             <w:r>
@@ -1034,69 +1573,118 @@
                 <w:rFonts w:ascii="Hind Siliguri" w:hAnsi="Hind Siliguri" w:cs="Hind Siliguri"/>
                 <w:b/>
                 <w:color w:val="0369A1"/>
-                <w:sz w:val="16"/>
-              </w:rPr>
-              <w:t>২</w:t>
+                <w:sz w:val="28"/>
+                <w:szCs w:val="28"/>
+              </w:rPr>
+              <w:t>৩</w:t>
             </w:r>
           </w:p>
         </w:tc>
         <w:tc>
           <w:tcPr>
-            <w:tcW w:w="6871" w:type="dxa"/>
-            <w:tcBorders>
-              <w:top w:val="single" w:sz="4" w:space="0" w:color="CBD5E1"/>
-              <w:left w:val="single" w:sz="4" w:space="0" w:color="CBD5E1"/>
-              <w:bottom w:val="single" w:sz="4" w:space="0" w:color="CBD5E1"/>
-              <w:right w:val="single" w:sz="4" w:space="0" w:color="CBD5E1"/>
-            </w:tcBorders>
-            <w:shd w:val="clear" w:color="auto" w:fill="F8FAFC"/>
-            <w:tcMar>
-              <w:top w:w="45" w:type="dxa"/>
-              <w:left w:w="80" w:type="dxa"/>
-              <w:bottom w:w="45" w:type="dxa"/>
-              <w:right w:w="80" w:type="dxa"/>
-            </w:tcMar>
+            <w:tcW w:w="8010" w:type="dxa"/>
           </w:tcPr>
           <w:p>
             <w:pPr>
-              <w:spacing w:after="0"/>
-              <w:rPr>
-                <w:rFonts w:ascii="Hind Siliguri" w:hAnsi="Hind Siliguri" w:cs="Hind Siliguri"/>
+              <w:rPr>
+                <w:rFonts w:ascii="Hind Siliguri" w:hAnsi="Hind Siliguri" w:cs="Hind Siliguri"/>
+                <w:sz w:val="28"/>
+                <w:szCs w:val="28"/>
               </w:rPr>
             </w:pPr>
             <w:r>
               <w:rPr>
                 <w:rFonts w:ascii="Hind Siliguri" w:hAnsi="Hind Siliguri" w:cs="Hind Siliguri"/>
                 <w:color w:val="1E293B"/>
-                <w:sz w:val="16"/>
-              </w:rPr>
-              <w:t>UAE লোডিং, শিপিং লাইন চার্জ, L/C কমিশন/ ঠেলা ফোর্ট</w:t>
-            </w:r>
+                <w:sz w:val="28"/>
+                <w:szCs w:val="28"/>
+              </w:rPr>
+              <w:t xml:space="preserve">UAE </w:t>
+            </w:r>
+            <w:proofErr w:type="spellStart"/>
+            <w:r>
+              <w:rPr>
+                <w:rFonts w:ascii="Hind Siliguri" w:hAnsi="Hind Siliguri" w:cs="Hind Siliguri"/>
+                <w:color w:val="1E293B"/>
+                <w:sz w:val="28"/>
+                <w:szCs w:val="28"/>
+              </w:rPr>
+              <w:t>শিপিং</w:t>
+            </w:r>
+            <w:proofErr w:type="spellEnd"/>
+            <w:r>
+              <w:rPr>
+                <w:rFonts w:ascii="Hind Siliguri" w:hAnsi="Hind Siliguri" w:cs="Hind Siliguri"/>
+                <w:color w:val="1E293B"/>
+                <w:sz w:val="28"/>
+                <w:szCs w:val="28"/>
+              </w:rPr>
+              <w:t xml:space="preserve"> </w:t>
+            </w:r>
+            <w:proofErr w:type="spellStart"/>
+            <w:r>
+              <w:rPr>
+                <w:rFonts w:ascii="Hind Siliguri" w:hAnsi="Hind Siliguri" w:cs="Hind Siliguri"/>
+                <w:color w:val="1E293B"/>
+                <w:sz w:val="28"/>
+                <w:szCs w:val="28"/>
+              </w:rPr>
+              <w:t>লাইন</w:t>
+            </w:r>
+            <w:proofErr w:type="spellEnd"/>
+            <w:r>
+              <w:rPr>
+                <w:rFonts w:ascii="Hind Siliguri" w:hAnsi="Hind Siliguri" w:cs="Hind Siliguri"/>
+                <w:color w:val="1E293B"/>
+                <w:sz w:val="28"/>
+                <w:szCs w:val="28"/>
+              </w:rPr>
+              <w:t xml:space="preserve"> </w:t>
+            </w:r>
+            <w:proofErr w:type="spellStart"/>
+            <w:r>
+              <w:rPr>
+                <w:rFonts w:ascii="Hind Siliguri" w:hAnsi="Hind Siliguri" w:cs="Hind Siliguri"/>
+                <w:color w:val="1E293B"/>
+                <w:sz w:val="28"/>
+                <w:szCs w:val="28"/>
+              </w:rPr>
+              <w:t>চার্জ</w:t>
+            </w:r>
+            <w:proofErr w:type="spellEnd"/>
+            <w:r>
+              <w:rPr>
+                <w:rFonts w:ascii="Hind Siliguri" w:hAnsi="Hind Siliguri" w:cs="Hind Siliguri"/>
+                <w:color w:val="1E293B"/>
+                <w:sz w:val="28"/>
+                <w:szCs w:val="28"/>
+              </w:rPr>
+              <w:t xml:space="preserve">, L/C </w:t>
+            </w:r>
+            <w:proofErr w:type="spellStart"/>
+            <w:r>
+              <w:rPr>
+                <w:rFonts w:ascii="Hind Siliguri" w:hAnsi="Hind Siliguri" w:cs="Hind Siliguri"/>
+                <w:color w:val="1E293B"/>
+                <w:sz w:val="28"/>
+                <w:szCs w:val="28"/>
+              </w:rPr>
+              <w:t>কমিশন</w:t>
+            </w:r>
+            <w:proofErr w:type="spellEnd"/>
           </w:p>
         </w:tc>
         <w:tc>
           <w:tcPr>
-            <w:tcW w:w="3237" w:type="dxa"/>
-            <w:tcBorders>
-              <w:top w:val="single" w:sz="4" w:space="0" w:color="CBD5E1"/>
-              <w:left w:val="single" w:sz="4" w:space="0" w:color="CBD5E1"/>
-              <w:bottom w:val="single" w:sz="4" w:space="0" w:color="CBD5E1"/>
-              <w:right w:val="single" w:sz="4" w:space="0" w:color="CBD5E1"/>
-            </w:tcBorders>
-            <w:shd w:val="clear" w:color="auto" w:fill="F8FAFC"/>
-            <w:tcMar>
-              <w:top w:w="45" w:type="dxa"/>
-              <w:left w:w="60" w:type="dxa"/>
-              <w:bottom w:w="45" w:type="dxa"/>
-              <w:right w:w="60" w:type="dxa"/>
-            </w:tcMar>
+            <w:tcW w:w="2340" w:type="dxa"/>
           </w:tcPr>
           <w:p>
             <w:pPr>
-              <w:spacing w:after="0"/>
               <w:jc w:val="right"/>
               <w:rPr>
                 <w:rFonts w:ascii="Hind Siliguri" w:hAnsi="Hind Siliguri" w:cs="Hind Siliguri"/>
+                <w:sz w:val="28"/>
+                <w:szCs w:val="28"/>
               </w:rPr>
             </w:pPr>
           </w:p>
@@ -1104,32 +1692,19 @@
       </w:tr>
       <w:tr>
         <w:trPr>
-          <w:trHeight w:val="346"/>
-          <w:jc w:val="center"/>
+          <w:trHeight w:val="463"/>
         </w:trPr>
         <w:tc>
           <w:tcPr>
-            <w:tcW w:w="576" w:type="dxa"/>
-            <w:tcBorders>
-              <w:top w:val="single" w:sz="4" w:space="0" w:color="CBD5E1"/>
-              <w:left w:val="single" w:sz="4" w:space="0" w:color="CBD5E1"/>
-              <w:bottom w:val="single" w:sz="4" w:space="0" w:color="CBD5E1"/>
-              <w:right w:val="single" w:sz="4" w:space="0" w:color="CBD5E1"/>
-            </w:tcBorders>
-            <w:shd w:val="clear" w:color="auto" w:fill="FFFFFF"/>
-            <w:tcMar>
-              <w:top w:w="45" w:type="dxa"/>
-              <w:left w:w="40" w:type="dxa"/>
-              <w:bottom w:w="45" w:type="dxa"/>
-              <w:right w:w="40" w:type="dxa"/>
-            </w:tcMar>
+            <w:tcW w:w="810" w:type="dxa"/>
           </w:tcPr>
           <w:p>
             <w:pPr>
-              <w:spacing w:after="0"/>
               <w:jc w:val="center"/>
               <w:rPr>
                 <w:rFonts w:ascii="Hind Siliguri" w:hAnsi="Hind Siliguri" w:cs="Hind Siliguri"/>
+                <w:sz w:val="28"/>
+                <w:szCs w:val="28"/>
               </w:rPr>
             </w:pPr>
             <w:r>
@@ -1137,69 +1712,169 @@
                 <w:rFonts w:ascii="Hind Siliguri" w:hAnsi="Hind Siliguri" w:cs="Hind Siliguri"/>
                 <w:b/>
                 <w:color w:val="0369A1"/>
-                <w:sz w:val="16"/>
-              </w:rPr>
-              <w:t>৩</w:t>
+                <w:sz w:val="28"/>
+                <w:szCs w:val="28"/>
+              </w:rPr>
+              <w:t>৪</w:t>
             </w:r>
           </w:p>
         </w:tc>
         <w:tc>
           <w:tcPr>
-            <w:tcW w:w="6871" w:type="dxa"/>
-            <w:tcBorders>
-              <w:top w:val="single" w:sz="4" w:space="0" w:color="CBD5E1"/>
-              <w:left w:val="single" w:sz="4" w:space="0" w:color="CBD5E1"/>
-              <w:bottom w:val="single" w:sz="4" w:space="0" w:color="CBD5E1"/>
-              <w:right w:val="single" w:sz="4" w:space="0" w:color="CBD5E1"/>
-            </w:tcBorders>
-            <w:shd w:val="clear" w:color="auto" w:fill="FFFFFF"/>
-            <w:tcMar>
-              <w:top w:w="45" w:type="dxa"/>
-              <w:left w:w="80" w:type="dxa"/>
-              <w:bottom w:w="45" w:type="dxa"/>
-              <w:right w:w="80" w:type="dxa"/>
-            </w:tcMar>
+            <w:tcW w:w="8010" w:type="dxa"/>
           </w:tcPr>
           <w:p>
             <w:pPr>
-              <w:spacing w:after="0"/>
-              <w:rPr>
-                <w:rFonts w:ascii="Hind Siliguri" w:hAnsi="Hind Siliguri" w:cs="Hind Siliguri"/>
+              <w:rPr>
+                <w:rFonts w:ascii="Hind Siliguri" w:hAnsi="Hind Siliguri" w:cs="Hind Siliguri"/>
+                <w:sz w:val="28"/>
+                <w:szCs w:val="28"/>
               </w:rPr>
             </w:pPr>
+            <w:proofErr w:type="spellStart"/>
             <w:r>
               <w:rPr>
                 <w:rFonts w:ascii="Hind Siliguri" w:hAnsi="Hind Siliguri" w:cs="Hind Siliguri"/>
                 <w:color w:val="1E293B"/>
-                <w:sz w:val="16"/>
-              </w:rPr>
-              <w:t>ইসলামী ব্যাংক L/C (আরিয়ান বা অন্যান্য)</w:t>
-            </w:r>
+                <w:sz w:val="28"/>
+                <w:szCs w:val="28"/>
+              </w:rPr>
+              <w:t>ইসলামী</w:t>
+            </w:r>
+            <w:proofErr w:type="spellEnd"/>
+            <w:r>
+              <w:rPr>
+                <w:rFonts w:ascii="Hind Siliguri" w:hAnsi="Hind Siliguri" w:cs="Hind Siliguri"/>
+                <w:color w:val="1E293B"/>
+                <w:sz w:val="28"/>
+                <w:szCs w:val="28"/>
+              </w:rPr>
+              <w:t xml:space="preserve"> </w:t>
+            </w:r>
+            <w:proofErr w:type="spellStart"/>
+            <w:r>
+              <w:rPr>
+                <w:rFonts w:ascii="Hind Siliguri" w:hAnsi="Hind Siliguri" w:cs="Hind Siliguri"/>
+                <w:color w:val="1E293B"/>
+                <w:sz w:val="28"/>
+                <w:szCs w:val="28"/>
+              </w:rPr>
+              <w:t>ব্যাংক</w:t>
+            </w:r>
+            <w:proofErr w:type="spellEnd"/>
+            <w:r>
+              <w:rPr>
+                <w:rFonts w:ascii="Hind Siliguri" w:hAnsi="Hind Siliguri" w:cs="Hind Siliguri"/>
+                <w:color w:val="1E293B"/>
+                <w:sz w:val="28"/>
+                <w:szCs w:val="28"/>
+              </w:rPr>
+              <w:t xml:space="preserve"> L/C (</w:t>
+            </w:r>
+            <w:proofErr w:type="spellStart"/>
+            <w:r>
+              <w:rPr>
+                <w:rFonts w:ascii="Hind Siliguri" w:hAnsi="Hind Siliguri" w:cs="Hind Siliguri"/>
+                <w:color w:val="1E293B"/>
+                <w:sz w:val="28"/>
+                <w:szCs w:val="28"/>
+              </w:rPr>
+              <w:t>আরিয়ান</w:t>
+            </w:r>
+            <w:proofErr w:type="spellEnd"/>
+            <w:r>
+              <w:rPr>
+                <w:rFonts w:ascii="Hind Siliguri" w:hAnsi="Hind Siliguri" w:cs="Hind Siliguri"/>
+                <w:color w:val="1E293B"/>
+                <w:sz w:val="28"/>
+                <w:szCs w:val="28"/>
+              </w:rPr>
+              <w:t xml:space="preserve"> </w:t>
+            </w:r>
+            <w:proofErr w:type="spellStart"/>
+            <w:r>
+              <w:rPr>
+                <w:rFonts w:ascii="Hind Siliguri" w:hAnsi="Hind Siliguri" w:cs="Hind Siliguri"/>
+                <w:color w:val="1E293B"/>
+                <w:sz w:val="28"/>
+                <w:szCs w:val="28"/>
+              </w:rPr>
+              <w:t>বা</w:t>
+            </w:r>
+            <w:proofErr w:type="spellEnd"/>
+            <w:r>
+              <w:rPr>
+                <w:rFonts w:ascii="Hind Siliguri" w:hAnsi="Hind Siliguri" w:cs="Hind Siliguri"/>
+                <w:color w:val="1E293B"/>
+                <w:sz w:val="28"/>
+                <w:szCs w:val="28"/>
+              </w:rPr>
+              <w:t xml:space="preserve"> </w:t>
+            </w:r>
+            <w:proofErr w:type="spellStart"/>
+            <w:r>
+              <w:rPr>
+                <w:rFonts w:ascii="Hind Siliguri" w:hAnsi="Hind Siliguri" w:cs="Hind Siliguri"/>
+                <w:color w:val="1E293B"/>
+                <w:sz w:val="28"/>
+                <w:szCs w:val="28"/>
+              </w:rPr>
+              <w:t>অন্যান্য</w:t>
+            </w:r>
+            <w:proofErr w:type="spellEnd"/>
+            <w:r>
+              <w:rPr>
+                <w:rFonts w:ascii="Hind Siliguri" w:hAnsi="Hind Siliguri" w:cs="Hind Siliguri"/>
+                <w:color w:val="1E293B"/>
+                <w:sz w:val="28"/>
+                <w:szCs w:val="28"/>
+              </w:rPr>
+              <w:t xml:space="preserve">) </w:t>
+            </w:r>
+            <w:proofErr w:type="spellStart"/>
+            <w:r>
+              <w:rPr>
+                <w:rFonts w:ascii="Hind Siliguri" w:hAnsi="Hind Siliguri" w:cs="Hind Siliguri"/>
+                <w:color w:val="1E293B"/>
+                <w:sz w:val="28"/>
+                <w:szCs w:val="28"/>
+              </w:rPr>
+              <w:t>প্রাথমিক</w:t>
+            </w:r>
+            <w:proofErr w:type="spellEnd"/>
+            <w:r>
+              <w:rPr>
+                <w:rFonts w:ascii="Hind Siliguri" w:hAnsi="Hind Siliguri" w:cs="Hind Siliguri"/>
+                <w:color w:val="1E293B"/>
+                <w:sz w:val="28"/>
+                <w:szCs w:val="28"/>
+              </w:rPr>
+              <w:t xml:space="preserve"> </w:t>
+            </w:r>
+            <w:proofErr w:type="spellStart"/>
+            <w:r>
+              <w:rPr>
+                <w:rFonts w:ascii="Hind Siliguri" w:hAnsi="Hind Siliguri" w:cs="Hind Siliguri"/>
+                <w:color w:val="1E293B"/>
+                <w:sz w:val="28"/>
+                <w:szCs w:val="28"/>
+              </w:rPr>
+              <w:t>চার্জ</w:t>
+            </w:r>
+            <w:proofErr w:type="spellEnd"/>
           </w:p>
         </w:tc>
         <w:tc>
           <w:tcPr>
-            <w:tcW w:w="3237" w:type="dxa"/>
-            <w:tcBorders>
-              <w:top w:val="single" w:sz="4" w:space="0" w:color="CBD5E1"/>
-              <w:left w:val="single" w:sz="4" w:space="0" w:color="CBD5E1"/>
-              <w:bottom w:val="single" w:sz="4" w:space="0" w:color="CBD5E1"/>
-              <w:right w:val="single" w:sz="4" w:space="0" w:color="CBD5E1"/>
-            </w:tcBorders>
-            <w:shd w:val="clear" w:color="auto" w:fill="FFFFFF"/>
-            <w:tcMar>
-              <w:top w:w="45" w:type="dxa"/>
-              <w:left w:w="60" w:type="dxa"/>
-              <w:bottom w:w="45" w:type="dxa"/>
-              <w:right w:w="60" w:type="dxa"/>
-            </w:tcMar>
+            <w:tcW w:w="2340" w:type="dxa"/>
           </w:tcPr>
           <w:p>
             <w:pPr>
-              <w:spacing w:after="0"/>
               <w:jc w:val="right"/>
               <w:rPr>
                 <w:rFonts w:ascii="Hind Siliguri" w:hAnsi="Hind Siliguri" w:cs="Hind Siliguri"/>
+                <w:sz w:val="28"/>
+                <w:szCs w:val="28"/>
               </w:rPr>
             </w:pPr>
           </w:p>
@@ -1207,32 +1882,19 @@
       </w:tr>
       <w:tr>
         <w:trPr>
-          <w:trHeight w:val="346"/>
-          <w:jc w:val="center"/>
+          <w:trHeight w:val="463"/>
         </w:trPr>
         <w:tc>
           <w:tcPr>
-            <w:tcW w:w="576" w:type="dxa"/>
-            <w:tcBorders>
-              <w:top w:val="single" w:sz="4" w:space="0" w:color="CBD5E1"/>
-              <w:left w:val="single" w:sz="4" w:space="0" w:color="CBD5E1"/>
-              <w:bottom w:val="single" w:sz="4" w:space="0" w:color="CBD5E1"/>
-              <w:right w:val="single" w:sz="4" w:space="0" w:color="CBD5E1"/>
-            </w:tcBorders>
-            <w:shd w:val="clear" w:color="auto" w:fill="F8FAFC"/>
-            <w:tcMar>
-              <w:top w:w="45" w:type="dxa"/>
-              <w:left w:w="40" w:type="dxa"/>
-              <w:bottom w:w="45" w:type="dxa"/>
-              <w:right w:w="40" w:type="dxa"/>
-            </w:tcMar>
+            <w:tcW w:w="810" w:type="dxa"/>
           </w:tcPr>
           <w:p>
             <w:pPr>
-              <w:spacing w:after="0"/>
               <w:jc w:val="center"/>
               <w:rPr>
                 <w:rFonts w:ascii="Hind Siliguri" w:hAnsi="Hind Siliguri" w:cs="Hind Siliguri"/>
+                <w:sz w:val="28"/>
+                <w:szCs w:val="28"/>
               </w:rPr>
             </w:pPr>
             <w:r>
@@ -1240,69 +1902,98 @@
                 <w:rFonts w:ascii="Hind Siliguri" w:hAnsi="Hind Siliguri" w:cs="Hind Siliguri"/>
                 <w:b/>
                 <w:color w:val="0369A1"/>
-                <w:sz w:val="16"/>
-              </w:rPr>
-              <w:t>৪</w:t>
+                <w:sz w:val="28"/>
+                <w:szCs w:val="28"/>
+              </w:rPr>
+              <w:t>৫</w:t>
             </w:r>
           </w:p>
         </w:tc>
         <w:tc>
           <w:tcPr>
-            <w:tcW w:w="6871" w:type="dxa"/>
-            <w:tcBorders>
-              <w:top w:val="single" w:sz="4" w:space="0" w:color="CBD5E1"/>
-              <w:left w:val="single" w:sz="4" w:space="0" w:color="CBD5E1"/>
-              <w:bottom w:val="single" w:sz="4" w:space="0" w:color="CBD5E1"/>
-              <w:right w:val="single" w:sz="4" w:space="0" w:color="CBD5E1"/>
-            </w:tcBorders>
-            <w:shd w:val="clear" w:color="auto" w:fill="F8FAFC"/>
-            <w:tcMar>
-              <w:top w:w="45" w:type="dxa"/>
-              <w:left w:w="80" w:type="dxa"/>
-              <w:bottom w:w="45" w:type="dxa"/>
-              <w:right w:w="80" w:type="dxa"/>
-            </w:tcMar>
+            <w:tcW w:w="8010" w:type="dxa"/>
           </w:tcPr>
           <w:p>
             <w:pPr>
-              <w:spacing w:after="0"/>
-              <w:rPr>
-                <w:rFonts w:ascii="Hind Siliguri" w:hAnsi="Hind Siliguri" w:cs="Hind Siliguri"/>
+              <w:rPr>
+                <w:rFonts w:ascii="Hind Siliguri" w:hAnsi="Hind Siliguri" w:cs="Hind Siliguri"/>
+                <w:sz w:val="28"/>
+                <w:szCs w:val="28"/>
               </w:rPr>
             </w:pPr>
+            <w:proofErr w:type="spellStart"/>
             <w:r>
               <w:rPr>
                 <w:rFonts w:ascii="Hind Siliguri" w:hAnsi="Hind Siliguri" w:cs="Hind Siliguri"/>
                 <w:color w:val="1E293B"/>
-                <w:sz w:val="16"/>
-              </w:rPr>
-              <w:t xml:space="preserve">কাস্টমস ক্লিয়ারেন্স সার্টিফিকেট ফি </w:t>
+                <w:sz w:val="28"/>
+                <w:szCs w:val="28"/>
+              </w:rPr>
+              <w:t>ইন্সফেকশন</w:t>
+            </w:r>
+            <w:proofErr w:type="spellEnd"/>
+            <w:r>
+              <w:rPr>
+                <w:rFonts w:ascii="Hind Siliguri" w:hAnsi="Hind Siliguri" w:cs="Hind Siliguri"/>
+                <w:color w:val="1E293B"/>
+                <w:sz w:val="28"/>
+                <w:szCs w:val="28"/>
+              </w:rPr>
+              <w:t xml:space="preserve"> </w:t>
+            </w:r>
+            <w:proofErr w:type="spellStart"/>
+            <w:r>
+              <w:rPr>
+                <w:rFonts w:ascii="Hind Siliguri" w:hAnsi="Hind Siliguri" w:cs="Hind Siliguri"/>
+                <w:color w:val="1E293B"/>
+                <w:sz w:val="28"/>
+                <w:szCs w:val="28"/>
+              </w:rPr>
+              <w:t>সার্টিফিকেট</w:t>
+            </w:r>
+            <w:proofErr w:type="spellEnd"/>
+            <w:r>
+              <w:rPr>
+                <w:rFonts w:ascii="Hind Siliguri" w:hAnsi="Hind Siliguri" w:cs="Hind Siliguri"/>
+                <w:color w:val="1E293B"/>
+                <w:sz w:val="28"/>
+                <w:szCs w:val="28"/>
+              </w:rPr>
+              <w:t xml:space="preserve"> </w:t>
+            </w:r>
+            <w:proofErr w:type="spellStart"/>
+            <w:r>
+              <w:rPr>
+                <w:rFonts w:ascii="Hind Siliguri" w:hAnsi="Hind Siliguri" w:cs="Hind Siliguri"/>
+                <w:color w:val="1E293B"/>
+                <w:sz w:val="28"/>
+                <w:szCs w:val="28"/>
+              </w:rPr>
+              <w:t>ফি</w:t>
+            </w:r>
+            <w:proofErr w:type="spellEnd"/>
+            <w:r>
+              <w:rPr>
+                <w:rFonts w:ascii="Hind Siliguri" w:hAnsi="Hind Siliguri" w:cs="Hind Siliguri"/>
+                <w:color w:val="1E293B"/>
+                <w:sz w:val="28"/>
+                <w:szCs w:val="28"/>
+              </w:rPr>
+              <w:t xml:space="preserve"> </w:t>
             </w:r>
           </w:p>
         </w:tc>
         <w:tc>
           <w:tcPr>
-            <w:tcW w:w="3237" w:type="dxa"/>
-            <w:tcBorders>
-              <w:top w:val="single" w:sz="4" w:space="0" w:color="CBD5E1"/>
-              <w:left w:val="single" w:sz="4" w:space="0" w:color="CBD5E1"/>
-              <w:bottom w:val="single" w:sz="4" w:space="0" w:color="CBD5E1"/>
-              <w:right w:val="single" w:sz="4" w:space="0" w:color="CBD5E1"/>
-            </w:tcBorders>
-            <w:shd w:val="clear" w:color="auto" w:fill="F8FAFC"/>
-            <w:tcMar>
-              <w:top w:w="45" w:type="dxa"/>
-              <w:left w:w="60" w:type="dxa"/>
-              <w:bottom w:w="45" w:type="dxa"/>
-              <w:right w:w="60" w:type="dxa"/>
-            </w:tcMar>
+            <w:tcW w:w="2340" w:type="dxa"/>
           </w:tcPr>
           <w:p>
             <w:pPr>
-              <w:spacing w:after="0"/>
               <w:jc w:val="right"/>
               <w:rPr>
                 <w:rFonts w:ascii="Hind Siliguri" w:hAnsi="Hind Siliguri" w:cs="Hind Siliguri"/>
+                <w:sz w:val="28"/>
+                <w:szCs w:val="28"/>
               </w:rPr>
             </w:pPr>
           </w:p>
@@ -1310,32 +2001,19 @@
       </w:tr>
       <w:tr>
         <w:trPr>
-          <w:trHeight w:val="346"/>
-          <w:jc w:val="center"/>
+          <w:trHeight w:val="463"/>
         </w:trPr>
         <w:tc>
           <w:tcPr>
-            <w:tcW w:w="576" w:type="dxa"/>
-            <w:tcBorders>
-              <w:top w:val="single" w:sz="4" w:space="0" w:color="CBD5E1"/>
-              <w:left w:val="single" w:sz="4" w:space="0" w:color="CBD5E1"/>
-              <w:bottom w:val="single" w:sz="4" w:space="0" w:color="CBD5E1"/>
-              <w:right w:val="single" w:sz="4" w:space="0" w:color="CBD5E1"/>
-            </w:tcBorders>
-            <w:shd w:val="clear" w:color="auto" w:fill="FFFFFF"/>
-            <w:tcMar>
-              <w:top w:w="45" w:type="dxa"/>
-              <w:left w:w="40" w:type="dxa"/>
-              <w:bottom w:w="45" w:type="dxa"/>
-              <w:right w:w="40" w:type="dxa"/>
-            </w:tcMar>
+            <w:tcW w:w="810" w:type="dxa"/>
           </w:tcPr>
           <w:p>
             <w:pPr>
-              <w:spacing w:after="0"/>
               <w:jc w:val="center"/>
               <w:rPr>
                 <w:rFonts w:ascii="Hind Siliguri" w:hAnsi="Hind Siliguri" w:cs="Hind Siliguri"/>
+                <w:sz w:val="28"/>
+                <w:szCs w:val="28"/>
               </w:rPr>
             </w:pPr>
             <w:r>
@@ -1343,69 +2021,109 @@
                 <w:rFonts w:ascii="Hind Siliguri" w:hAnsi="Hind Siliguri" w:cs="Hind Siliguri"/>
                 <w:b/>
                 <w:color w:val="0369A1"/>
-                <w:sz w:val="16"/>
-              </w:rPr>
-              <w:t>৫</w:t>
+                <w:sz w:val="28"/>
+                <w:szCs w:val="28"/>
+              </w:rPr>
+              <w:t>৬</w:t>
             </w:r>
           </w:p>
         </w:tc>
         <w:tc>
           <w:tcPr>
-            <w:tcW w:w="6871" w:type="dxa"/>
-            <w:tcBorders>
-              <w:top w:val="single" w:sz="4" w:space="0" w:color="CBD5E1"/>
-              <w:left w:val="single" w:sz="4" w:space="0" w:color="CBD5E1"/>
-              <w:bottom w:val="single" w:sz="4" w:space="0" w:color="CBD5E1"/>
-              <w:right w:val="single" w:sz="4" w:space="0" w:color="CBD5E1"/>
-            </w:tcBorders>
-            <w:shd w:val="clear" w:color="auto" w:fill="FFFFFF"/>
-            <w:tcMar>
-              <w:top w:w="45" w:type="dxa"/>
-              <w:left w:w="80" w:type="dxa"/>
-              <w:bottom w:w="45" w:type="dxa"/>
-              <w:right w:w="80" w:type="dxa"/>
-            </w:tcMar>
+            <w:tcW w:w="8010" w:type="dxa"/>
           </w:tcPr>
           <w:p>
             <w:pPr>
-              <w:spacing w:after="0"/>
-              <w:rPr>
-                <w:rFonts w:ascii="Hind Siliguri" w:hAnsi="Hind Siliguri" w:cs="Hind Siliguri"/>
+              <w:rPr>
+                <w:rFonts w:ascii="Hind Siliguri" w:hAnsi="Hind Siliguri" w:cs="Hind Siliguri"/>
+                <w:sz w:val="28"/>
+                <w:szCs w:val="28"/>
               </w:rPr>
             </w:pPr>
+            <w:proofErr w:type="spellStart"/>
             <w:r>
               <w:rPr>
                 <w:rFonts w:ascii="Hind Siliguri" w:hAnsi="Hind Siliguri" w:cs="Hind Siliguri"/>
                 <w:color w:val="1E293B"/>
-                <w:sz w:val="16"/>
-              </w:rPr>
-              <w:t>কন্টেইনার ঠেলা ও গেট পারমিশন চার্জ</w:t>
-            </w:r>
+                <w:sz w:val="28"/>
+                <w:szCs w:val="28"/>
+              </w:rPr>
+              <w:t>কন্টেইনার</w:t>
+            </w:r>
+            <w:proofErr w:type="spellEnd"/>
+            <w:r>
+              <w:rPr>
+                <w:rFonts w:ascii="Hind Siliguri" w:hAnsi="Hind Siliguri" w:cs="Hind Siliguri"/>
+                <w:color w:val="1E293B"/>
+                <w:sz w:val="28"/>
+                <w:szCs w:val="28"/>
+              </w:rPr>
+              <w:t xml:space="preserve"> </w:t>
+            </w:r>
+            <w:proofErr w:type="spellStart"/>
+            <w:r>
+              <w:rPr>
+                <w:rFonts w:ascii="Hind Siliguri" w:hAnsi="Hind Siliguri" w:cs="Hind Siliguri"/>
+                <w:color w:val="1E293B"/>
+                <w:sz w:val="28"/>
+                <w:szCs w:val="28"/>
+              </w:rPr>
+              <w:t>ঠেলা</w:t>
+            </w:r>
+            <w:proofErr w:type="spellEnd"/>
+            <w:r>
+              <w:rPr>
+                <w:rFonts w:ascii="Hind Siliguri" w:hAnsi="Hind Siliguri" w:cs="Hind Siliguri"/>
+                <w:color w:val="1E293B"/>
+                <w:sz w:val="28"/>
+                <w:szCs w:val="28"/>
+              </w:rPr>
+              <w:t xml:space="preserve"> ও </w:t>
+            </w:r>
+            <w:proofErr w:type="spellStart"/>
+            <w:r>
+              <w:rPr>
+                <w:rFonts w:ascii="Hind Siliguri" w:hAnsi="Hind Siliguri" w:cs="Hind Siliguri"/>
+                <w:color w:val="1E293B"/>
+                <w:sz w:val="28"/>
+                <w:szCs w:val="28"/>
+              </w:rPr>
+              <w:t>পারমিশন</w:t>
+            </w:r>
+            <w:proofErr w:type="spellEnd"/>
+            <w:r>
+              <w:rPr>
+                <w:rFonts w:ascii="Hind Siliguri" w:hAnsi="Hind Siliguri" w:cs="Hind Siliguri"/>
+                <w:color w:val="1E293B"/>
+                <w:sz w:val="28"/>
+                <w:szCs w:val="28"/>
+              </w:rPr>
+              <w:t xml:space="preserve"> </w:t>
+            </w:r>
+            <w:proofErr w:type="spellStart"/>
+            <w:r>
+              <w:rPr>
+                <w:rFonts w:ascii="Hind Siliguri" w:hAnsi="Hind Siliguri" w:cs="Hind Siliguri"/>
+                <w:color w:val="1E293B"/>
+                <w:sz w:val="28"/>
+                <w:szCs w:val="28"/>
+              </w:rPr>
+              <w:t>চার্জ</w:t>
+            </w:r>
+            <w:proofErr w:type="spellEnd"/>
           </w:p>
         </w:tc>
         <w:tc>
           <w:tcPr>
-            <w:tcW w:w="3237" w:type="dxa"/>
-            <w:tcBorders>
-              <w:top w:val="single" w:sz="4" w:space="0" w:color="CBD5E1"/>
-              <w:left w:val="single" w:sz="4" w:space="0" w:color="CBD5E1"/>
-              <w:bottom w:val="single" w:sz="4" w:space="0" w:color="CBD5E1"/>
-              <w:right w:val="single" w:sz="4" w:space="0" w:color="CBD5E1"/>
-            </w:tcBorders>
-            <w:shd w:val="clear" w:color="auto" w:fill="FFFFFF"/>
-            <w:tcMar>
-              <w:top w:w="45" w:type="dxa"/>
-              <w:left w:w="60" w:type="dxa"/>
-              <w:bottom w:w="45" w:type="dxa"/>
-              <w:right w:w="60" w:type="dxa"/>
-            </w:tcMar>
+            <w:tcW w:w="2340" w:type="dxa"/>
           </w:tcPr>
           <w:p>
             <w:pPr>
-              <w:spacing w:after="0"/>
               <w:jc w:val="right"/>
               <w:rPr>
                 <w:rFonts w:ascii="Hind Siliguri" w:hAnsi="Hind Siliguri" w:cs="Hind Siliguri"/>
+                <w:sz w:val="28"/>
+                <w:szCs w:val="28"/>
               </w:rPr>
             </w:pPr>
           </w:p>
@@ -1413,32 +2131,19 @@
       </w:tr>
       <w:tr>
         <w:trPr>
-          <w:trHeight w:val="346"/>
-          <w:jc w:val="center"/>
+          <w:trHeight w:val="450"/>
         </w:trPr>
         <w:tc>
           <w:tcPr>
-            <w:tcW w:w="576" w:type="dxa"/>
-            <w:tcBorders>
-              <w:top w:val="single" w:sz="4" w:space="0" w:color="CBD5E1"/>
-              <w:left w:val="single" w:sz="4" w:space="0" w:color="CBD5E1"/>
-              <w:bottom w:val="single" w:sz="4" w:space="0" w:color="CBD5E1"/>
-              <w:right w:val="single" w:sz="4" w:space="0" w:color="CBD5E1"/>
-            </w:tcBorders>
-            <w:shd w:val="clear" w:color="auto" w:fill="F8FAFC"/>
-            <w:tcMar>
-              <w:top w:w="45" w:type="dxa"/>
-              <w:left w:w="40" w:type="dxa"/>
-              <w:bottom w:w="45" w:type="dxa"/>
-              <w:right w:w="40" w:type="dxa"/>
-            </w:tcMar>
+            <w:tcW w:w="810" w:type="dxa"/>
           </w:tcPr>
           <w:p>
             <w:pPr>
-              <w:spacing w:after="0"/>
               <w:jc w:val="center"/>
               <w:rPr>
                 <w:rFonts w:ascii="Hind Siliguri" w:hAnsi="Hind Siliguri" w:cs="Hind Siliguri"/>
+                <w:sz w:val="28"/>
+                <w:szCs w:val="28"/>
               </w:rPr>
             </w:pPr>
             <w:r>
@@ -1446,69 +2151,129 @@
                 <w:rFonts w:ascii="Hind Siliguri" w:hAnsi="Hind Siliguri" w:cs="Hind Siliguri"/>
                 <w:b/>
                 <w:color w:val="0369A1"/>
-                <w:sz w:val="16"/>
-              </w:rPr>
-              <w:t>৬</w:t>
+                <w:sz w:val="28"/>
+                <w:szCs w:val="28"/>
+              </w:rPr>
+              <w:t>৭</w:t>
             </w:r>
           </w:p>
         </w:tc>
         <w:tc>
           <w:tcPr>
-            <w:tcW w:w="6871" w:type="dxa"/>
-            <w:tcBorders>
-              <w:top w:val="single" w:sz="4" w:space="0" w:color="CBD5E1"/>
-              <w:left w:val="single" w:sz="4" w:space="0" w:color="CBD5E1"/>
-              <w:bottom w:val="single" w:sz="4" w:space="0" w:color="CBD5E1"/>
-              <w:right w:val="single" w:sz="4" w:space="0" w:color="CBD5E1"/>
-            </w:tcBorders>
-            <w:shd w:val="clear" w:color="auto" w:fill="F8FAFC"/>
-            <w:tcMar>
-              <w:top w:w="45" w:type="dxa"/>
-              <w:left w:w="80" w:type="dxa"/>
-              <w:bottom w:w="45" w:type="dxa"/>
-              <w:right w:w="80" w:type="dxa"/>
-            </w:tcMar>
+            <w:tcW w:w="8010" w:type="dxa"/>
           </w:tcPr>
           <w:p>
             <w:pPr>
-              <w:spacing w:after="0"/>
-              <w:rPr>
-                <w:rFonts w:ascii="Hind Siliguri" w:hAnsi="Hind Siliguri" w:cs="Hind Siliguri"/>
+              <w:rPr>
+                <w:rFonts w:ascii="Hind Siliguri" w:hAnsi="Hind Siliguri" w:cs="Hind Siliguri"/>
+                <w:sz w:val="28"/>
+                <w:szCs w:val="28"/>
               </w:rPr>
             </w:pPr>
+            <w:proofErr w:type="spellStart"/>
             <w:r>
               <w:rPr>
                 <w:rFonts w:ascii="Hind Siliguri" w:hAnsi="Hind Siliguri" w:cs="Hind Siliguri"/>
                 <w:color w:val="1E293B"/>
-                <w:sz w:val="16"/>
-              </w:rPr>
-              <w:t>কাস্টমস পরীক্ষণ ও ঢাকা যাতায়াত খরচ</w:t>
-            </w:r>
+                <w:sz w:val="28"/>
+                <w:szCs w:val="28"/>
+              </w:rPr>
+              <w:t>কাস্টমস</w:t>
+            </w:r>
+            <w:proofErr w:type="spellEnd"/>
+            <w:r>
+              <w:rPr>
+                <w:rFonts w:ascii="Hind Siliguri" w:hAnsi="Hind Siliguri" w:cs="Hind Siliguri"/>
+                <w:color w:val="1E293B"/>
+                <w:sz w:val="28"/>
+                <w:szCs w:val="28"/>
+              </w:rPr>
+              <w:t xml:space="preserve"> </w:t>
+            </w:r>
+            <w:proofErr w:type="spellStart"/>
+            <w:r>
+              <w:rPr>
+                <w:rFonts w:ascii="Hind Siliguri" w:hAnsi="Hind Siliguri" w:cs="Hind Siliguri"/>
+                <w:color w:val="1E293B"/>
+                <w:sz w:val="28"/>
+                <w:szCs w:val="28"/>
+              </w:rPr>
+              <w:t>পরীক্ষণ</w:t>
+            </w:r>
+            <w:proofErr w:type="spellEnd"/>
+            <w:r>
+              <w:rPr>
+                <w:rFonts w:ascii="Hind Siliguri" w:hAnsi="Hind Siliguri" w:cs="Hind Siliguri"/>
+                <w:color w:val="1E293B"/>
+                <w:sz w:val="28"/>
+                <w:szCs w:val="28"/>
+              </w:rPr>
+              <w:t xml:space="preserve"> ও </w:t>
+            </w:r>
+            <w:proofErr w:type="spellStart"/>
+            <w:r>
+              <w:rPr>
+                <w:rFonts w:ascii="Hind Siliguri" w:hAnsi="Hind Siliguri" w:cs="Hind Siliguri"/>
+                <w:color w:val="1E293B"/>
+                <w:sz w:val="28"/>
+                <w:szCs w:val="28"/>
+              </w:rPr>
+              <w:t>ঢাকা</w:t>
+            </w:r>
+            <w:proofErr w:type="spellEnd"/>
+            <w:r>
+              <w:rPr>
+                <w:rFonts w:ascii="Hind Siliguri" w:hAnsi="Hind Siliguri" w:cs="Hind Siliguri"/>
+                <w:color w:val="1E293B"/>
+                <w:sz w:val="28"/>
+                <w:szCs w:val="28"/>
+              </w:rPr>
+              <w:t xml:space="preserve"> </w:t>
+            </w:r>
+            <w:proofErr w:type="spellStart"/>
+            <w:r>
+              <w:rPr>
+                <w:rFonts w:ascii="Hind Siliguri" w:hAnsi="Hind Siliguri" w:cs="Hind Siliguri"/>
+                <w:color w:val="1E293B"/>
+                <w:sz w:val="28"/>
+                <w:szCs w:val="28"/>
+              </w:rPr>
+              <w:t>যাতায়াত</w:t>
+            </w:r>
+            <w:proofErr w:type="spellEnd"/>
+            <w:r>
+              <w:rPr>
+                <w:rFonts w:ascii="Hind Siliguri" w:hAnsi="Hind Siliguri" w:cs="Hind Siliguri"/>
+                <w:color w:val="1E293B"/>
+                <w:sz w:val="28"/>
+                <w:szCs w:val="28"/>
+              </w:rPr>
+              <w:t xml:space="preserve"> </w:t>
+            </w:r>
+            <w:proofErr w:type="spellStart"/>
+            <w:r>
+              <w:rPr>
+                <w:rFonts w:ascii="Hind Siliguri" w:hAnsi="Hind Siliguri" w:cs="Hind Siliguri"/>
+                <w:color w:val="1E293B"/>
+                <w:sz w:val="28"/>
+                <w:szCs w:val="28"/>
+              </w:rPr>
+              <w:t>খরচ</w:t>
+            </w:r>
+            <w:proofErr w:type="spellEnd"/>
           </w:p>
         </w:tc>
         <w:tc>
           <w:tcPr>
-            <w:tcW w:w="3237" w:type="dxa"/>
-            <w:tcBorders>
-              <w:top w:val="single" w:sz="4" w:space="0" w:color="CBD5E1"/>
-              <w:left w:val="single" w:sz="4" w:space="0" w:color="CBD5E1"/>
-              <w:bottom w:val="single" w:sz="4" w:space="0" w:color="CBD5E1"/>
-              <w:right w:val="single" w:sz="4" w:space="0" w:color="CBD5E1"/>
-            </w:tcBorders>
-            <w:shd w:val="clear" w:color="auto" w:fill="F8FAFC"/>
-            <w:tcMar>
-              <w:top w:w="45" w:type="dxa"/>
-              <w:left w:w="60" w:type="dxa"/>
-              <w:bottom w:w="45" w:type="dxa"/>
-              <w:right w:w="60" w:type="dxa"/>
-            </w:tcMar>
+            <w:tcW w:w="2340" w:type="dxa"/>
           </w:tcPr>
           <w:p>
             <w:pPr>
-              <w:spacing w:after="0"/>
               <w:jc w:val="right"/>
               <w:rPr>
                 <w:rFonts w:ascii="Hind Siliguri" w:hAnsi="Hind Siliguri" w:cs="Hind Siliguri"/>
+                <w:sz w:val="28"/>
+                <w:szCs w:val="28"/>
               </w:rPr>
             </w:pPr>
           </w:p>
@@ -1516,32 +2281,19 @@
       </w:tr>
       <w:tr>
         <w:trPr>
-          <w:trHeight w:val="337"/>
-          <w:jc w:val="center"/>
+          <w:trHeight w:val="463"/>
         </w:trPr>
         <w:tc>
           <w:tcPr>
-            <w:tcW w:w="576" w:type="dxa"/>
-            <w:tcBorders>
-              <w:top w:val="single" w:sz="4" w:space="0" w:color="CBD5E1"/>
-              <w:left w:val="single" w:sz="4" w:space="0" w:color="CBD5E1"/>
-              <w:bottom w:val="single" w:sz="4" w:space="0" w:color="CBD5E1"/>
-              <w:right w:val="single" w:sz="4" w:space="0" w:color="CBD5E1"/>
-            </w:tcBorders>
-            <w:shd w:val="clear" w:color="auto" w:fill="FFFFFF"/>
-            <w:tcMar>
-              <w:top w:w="45" w:type="dxa"/>
-              <w:left w:w="40" w:type="dxa"/>
-              <w:bottom w:w="45" w:type="dxa"/>
-              <w:right w:w="40" w:type="dxa"/>
-            </w:tcMar>
+            <w:tcW w:w="810" w:type="dxa"/>
           </w:tcPr>
           <w:p>
             <w:pPr>
-              <w:spacing w:after="0"/>
               <w:jc w:val="center"/>
               <w:rPr>
                 <w:rFonts w:ascii="Hind Siliguri" w:hAnsi="Hind Siliguri" w:cs="Hind Siliguri"/>
+                <w:sz w:val="28"/>
+                <w:szCs w:val="28"/>
               </w:rPr>
             </w:pPr>
             <w:r>
@@ -1549,69 +2301,109 @@
                 <w:rFonts w:ascii="Hind Siliguri" w:hAnsi="Hind Siliguri" w:cs="Hind Siliguri"/>
                 <w:b/>
                 <w:color w:val="0369A1"/>
-                <w:sz w:val="16"/>
-              </w:rPr>
-              <w:t>৭</w:t>
+                <w:sz w:val="28"/>
+                <w:szCs w:val="28"/>
+              </w:rPr>
+              <w:t>৮</w:t>
             </w:r>
           </w:p>
         </w:tc>
         <w:tc>
           <w:tcPr>
-            <w:tcW w:w="6871" w:type="dxa"/>
-            <w:tcBorders>
-              <w:top w:val="single" w:sz="4" w:space="0" w:color="CBD5E1"/>
-              <w:left w:val="single" w:sz="4" w:space="0" w:color="CBD5E1"/>
-              <w:bottom w:val="single" w:sz="4" w:space="0" w:color="CBD5E1"/>
-              <w:right w:val="single" w:sz="4" w:space="0" w:color="CBD5E1"/>
-            </w:tcBorders>
-            <w:shd w:val="clear" w:color="auto" w:fill="FFFFFF"/>
-            <w:tcMar>
-              <w:top w:w="45" w:type="dxa"/>
-              <w:left w:w="80" w:type="dxa"/>
-              <w:bottom w:w="45" w:type="dxa"/>
-              <w:right w:w="80" w:type="dxa"/>
-            </w:tcMar>
+            <w:tcW w:w="8010" w:type="dxa"/>
           </w:tcPr>
           <w:p>
             <w:pPr>
-              <w:spacing w:after="0"/>
-              <w:rPr>
-                <w:rFonts w:ascii="Hind Siliguri" w:hAnsi="Hind Siliguri" w:cs="Hind Siliguri"/>
+              <w:rPr>
+                <w:rFonts w:ascii="Hind Siliguri" w:hAnsi="Hind Siliguri" w:cs="Hind Siliguri"/>
+                <w:sz w:val="28"/>
+                <w:szCs w:val="28"/>
               </w:rPr>
             </w:pPr>
+            <w:proofErr w:type="spellStart"/>
             <w:r>
               <w:rPr>
                 <w:rFonts w:ascii="Hind Siliguri" w:hAnsi="Hind Siliguri" w:cs="Hind Siliguri"/>
                 <w:color w:val="1E293B"/>
-                <w:sz w:val="16"/>
-              </w:rPr>
-              <w:t>গোডাউন যাতায়াত ও চা-নাস্তা খরচ</w:t>
-            </w:r>
+                <w:sz w:val="28"/>
+                <w:szCs w:val="28"/>
+              </w:rPr>
+              <w:t>গোডাউন</w:t>
+            </w:r>
+            <w:proofErr w:type="spellEnd"/>
+            <w:r>
+              <w:rPr>
+                <w:rFonts w:ascii="Hind Siliguri" w:hAnsi="Hind Siliguri" w:cs="Hind Siliguri"/>
+                <w:color w:val="1E293B"/>
+                <w:sz w:val="28"/>
+                <w:szCs w:val="28"/>
+              </w:rPr>
+              <w:t xml:space="preserve"> </w:t>
+            </w:r>
+            <w:proofErr w:type="spellStart"/>
+            <w:r>
+              <w:rPr>
+                <w:rFonts w:ascii="Hind Siliguri" w:hAnsi="Hind Siliguri" w:cs="Hind Siliguri"/>
+                <w:color w:val="1E293B"/>
+                <w:sz w:val="28"/>
+                <w:szCs w:val="28"/>
+              </w:rPr>
+              <w:t>যাতায়াত</w:t>
+            </w:r>
+            <w:proofErr w:type="spellEnd"/>
+            <w:r>
+              <w:rPr>
+                <w:rFonts w:ascii="Hind Siliguri" w:hAnsi="Hind Siliguri" w:cs="Hind Siliguri"/>
+                <w:color w:val="1E293B"/>
+                <w:sz w:val="28"/>
+                <w:szCs w:val="28"/>
+              </w:rPr>
+              <w:t xml:space="preserve"> ও </w:t>
+            </w:r>
+            <w:proofErr w:type="spellStart"/>
+            <w:r>
+              <w:rPr>
+                <w:rFonts w:ascii="Hind Siliguri" w:hAnsi="Hind Siliguri" w:cs="Hind Siliguri"/>
+                <w:color w:val="1E293B"/>
+                <w:sz w:val="28"/>
+                <w:szCs w:val="28"/>
+              </w:rPr>
+              <w:t>চা-নাস্তা</w:t>
+            </w:r>
+            <w:proofErr w:type="spellEnd"/>
+            <w:r>
+              <w:rPr>
+                <w:rFonts w:ascii="Hind Siliguri" w:hAnsi="Hind Siliguri" w:cs="Hind Siliguri"/>
+                <w:color w:val="1E293B"/>
+                <w:sz w:val="28"/>
+                <w:szCs w:val="28"/>
+              </w:rPr>
+              <w:t xml:space="preserve"> </w:t>
+            </w:r>
+            <w:proofErr w:type="spellStart"/>
+            <w:r>
+              <w:rPr>
+                <w:rFonts w:ascii="Hind Siliguri" w:hAnsi="Hind Siliguri" w:cs="Hind Siliguri"/>
+                <w:color w:val="1E293B"/>
+                <w:sz w:val="28"/>
+                <w:szCs w:val="28"/>
+              </w:rPr>
+              <w:t>খরচ</w:t>
+            </w:r>
+            <w:proofErr w:type="spellEnd"/>
           </w:p>
         </w:tc>
         <w:tc>
           <w:tcPr>
-            <w:tcW w:w="3237" w:type="dxa"/>
-            <w:tcBorders>
-              <w:top w:val="single" w:sz="4" w:space="0" w:color="CBD5E1"/>
-              <w:left w:val="single" w:sz="4" w:space="0" w:color="CBD5E1"/>
-              <w:bottom w:val="single" w:sz="4" w:space="0" w:color="CBD5E1"/>
-              <w:right w:val="single" w:sz="4" w:space="0" w:color="CBD5E1"/>
-            </w:tcBorders>
-            <w:shd w:val="clear" w:color="auto" w:fill="FFFFFF"/>
-            <w:tcMar>
-              <w:top w:w="45" w:type="dxa"/>
-              <w:left w:w="60" w:type="dxa"/>
-              <w:bottom w:w="45" w:type="dxa"/>
-              <w:right w:w="60" w:type="dxa"/>
-            </w:tcMar>
+            <w:tcW w:w="2340" w:type="dxa"/>
           </w:tcPr>
           <w:p>
             <w:pPr>
-              <w:spacing w:after="0"/>
               <w:jc w:val="right"/>
               <w:rPr>
                 <w:rFonts w:ascii="Hind Siliguri" w:hAnsi="Hind Siliguri" w:cs="Hind Siliguri"/>
+                <w:sz w:val="28"/>
+                <w:szCs w:val="28"/>
               </w:rPr>
             </w:pPr>
           </w:p>
@@ -1619,32 +2411,19 @@
       </w:tr>
       <w:tr>
         <w:trPr>
-          <w:trHeight w:val="346"/>
-          <w:jc w:val="center"/>
+          <w:trHeight w:val="463"/>
         </w:trPr>
         <w:tc>
           <w:tcPr>
-            <w:tcW w:w="576" w:type="dxa"/>
-            <w:tcBorders>
-              <w:top w:val="single" w:sz="4" w:space="0" w:color="CBD5E1"/>
-              <w:left w:val="single" w:sz="4" w:space="0" w:color="CBD5E1"/>
-              <w:bottom w:val="single" w:sz="4" w:space="0" w:color="CBD5E1"/>
-              <w:right w:val="single" w:sz="4" w:space="0" w:color="CBD5E1"/>
-            </w:tcBorders>
-            <w:shd w:val="clear" w:color="auto" w:fill="F8FAFC"/>
-            <w:tcMar>
-              <w:top w:w="45" w:type="dxa"/>
-              <w:left w:w="40" w:type="dxa"/>
-              <w:bottom w:w="45" w:type="dxa"/>
-              <w:right w:w="40" w:type="dxa"/>
-            </w:tcMar>
+            <w:tcW w:w="810" w:type="dxa"/>
           </w:tcPr>
           <w:p>
             <w:pPr>
-              <w:spacing w:after="0"/>
               <w:jc w:val="center"/>
               <w:rPr>
                 <w:rFonts w:ascii="Hind Siliguri" w:hAnsi="Hind Siliguri" w:cs="Hind Siliguri"/>
+                <w:sz w:val="28"/>
+                <w:szCs w:val="28"/>
               </w:rPr>
             </w:pPr>
             <w:r>
@@ -1652,69 +2431,149 @@
                 <w:rFonts w:ascii="Hind Siliguri" w:hAnsi="Hind Siliguri" w:cs="Hind Siliguri"/>
                 <w:b/>
                 <w:color w:val="0369A1"/>
-                <w:sz w:val="16"/>
-              </w:rPr>
-              <w:t>৮</w:t>
+                <w:sz w:val="28"/>
+                <w:szCs w:val="28"/>
+              </w:rPr>
+              <w:t>৯</w:t>
             </w:r>
           </w:p>
         </w:tc>
         <w:tc>
           <w:tcPr>
-            <w:tcW w:w="6871" w:type="dxa"/>
-            <w:tcBorders>
-              <w:top w:val="single" w:sz="4" w:space="0" w:color="CBD5E1"/>
-              <w:left w:val="single" w:sz="4" w:space="0" w:color="CBD5E1"/>
-              <w:bottom w:val="single" w:sz="4" w:space="0" w:color="CBD5E1"/>
-              <w:right w:val="single" w:sz="4" w:space="0" w:color="CBD5E1"/>
-            </w:tcBorders>
-            <w:shd w:val="clear" w:color="auto" w:fill="F8FAFC"/>
-            <w:tcMar>
-              <w:top w:w="45" w:type="dxa"/>
-              <w:left w:w="80" w:type="dxa"/>
-              <w:bottom w:w="45" w:type="dxa"/>
-              <w:right w:w="80" w:type="dxa"/>
-            </w:tcMar>
+            <w:tcW w:w="8010" w:type="dxa"/>
           </w:tcPr>
           <w:p>
             <w:pPr>
-              <w:spacing w:after="0"/>
-              <w:rPr>
-                <w:rFonts w:ascii="Hind Siliguri" w:hAnsi="Hind Siliguri" w:cs="Hind Siliguri"/>
+              <w:rPr>
+                <w:rFonts w:ascii="Hind Siliguri" w:hAnsi="Hind Siliguri" w:cs="Hind Siliguri"/>
+                <w:sz w:val="28"/>
+                <w:szCs w:val="28"/>
               </w:rPr>
             </w:pPr>
+            <w:proofErr w:type="spellStart"/>
             <w:r>
               <w:rPr>
                 <w:rFonts w:ascii="Hind Siliguri" w:hAnsi="Hind Siliguri" w:cs="Hind Siliguri"/>
                 <w:color w:val="1E293B"/>
-                <w:sz w:val="16"/>
-              </w:rPr>
-              <w:t>কাভার্ড ভ্যান ভাড়া, লেবার ও ক্রেন চার্জ</w:t>
-            </w:r>
+                <w:sz w:val="28"/>
+                <w:szCs w:val="28"/>
+              </w:rPr>
+              <w:t>কাভার্ড</w:t>
+            </w:r>
+            <w:proofErr w:type="spellEnd"/>
+            <w:r>
+              <w:rPr>
+                <w:rFonts w:ascii="Hind Siliguri" w:hAnsi="Hind Siliguri" w:cs="Hind Siliguri"/>
+                <w:color w:val="1E293B"/>
+                <w:sz w:val="28"/>
+                <w:szCs w:val="28"/>
+              </w:rPr>
+              <w:t xml:space="preserve"> </w:t>
+            </w:r>
+            <w:proofErr w:type="spellStart"/>
+            <w:r>
+              <w:rPr>
+                <w:rFonts w:ascii="Hind Siliguri" w:hAnsi="Hind Siliguri" w:cs="Hind Siliguri"/>
+                <w:color w:val="1E293B"/>
+                <w:sz w:val="28"/>
+                <w:szCs w:val="28"/>
+              </w:rPr>
+              <w:t>ভ্যান</w:t>
+            </w:r>
+            <w:proofErr w:type="spellEnd"/>
+            <w:r>
+              <w:rPr>
+                <w:rFonts w:ascii="Hind Siliguri" w:hAnsi="Hind Siliguri" w:cs="Hind Siliguri"/>
+                <w:color w:val="1E293B"/>
+                <w:sz w:val="28"/>
+                <w:szCs w:val="28"/>
+              </w:rPr>
+              <w:t xml:space="preserve"> </w:t>
+            </w:r>
+            <w:proofErr w:type="spellStart"/>
+            <w:r>
+              <w:rPr>
+                <w:rFonts w:ascii="Hind Siliguri" w:hAnsi="Hind Siliguri" w:cs="Hind Siliguri"/>
+                <w:color w:val="1E293B"/>
+                <w:sz w:val="28"/>
+                <w:szCs w:val="28"/>
+              </w:rPr>
+              <w:t>ভাড়া</w:t>
+            </w:r>
+            <w:proofErr w:type="spellEnd"/>
+            <w:r>
+              <w:rPr>
+                <w:rFonts w:ascii="Hind Siliguri" w:hAnsi="Hind Siliguri" w:cs="Hind Siliguri"/>
+                <w:color w:val="1E293B"/>
+                <w:sz w:val="28"/>
+                <w:szCs w:val="28"/>
+              </w:rPr>
+              <w:t xml:space="preserve">, </w:t>
+            </w:r>
+            <w:proofErr w:type="spellStart"/>
+            <w:r>
+              <w:rPr>
+                <w:rFonts w:ascii="Hind Siliguri" w:hAnsi="Hind Siliguri" w:cs="Hind Siliguri"/>
+                <w:color w:val="1E293B"/>
+                <w:sz w:val="28"/>
+                <w:szCs w:val="28"/>
+              </w:rPr>
+              <w:t>লেবার</w:t>
+            </w:r>
+            <w:proofErr w:type="spellEnd"/>
+            <w:r>
+              <w:rPr>
+                <w:rFonts w:ascii="Hind Siliguri" w:hAnsi="Hind Siliguri" w:cs="Hind Siliguri"/>
+                <w:color w:val="1E293B"/>
+                <w:sz w:val="28"/>
+                <w:szCs w:val="28"/>
+              </w:rPr>
+              <w:t xml:space="preserve"> ও </w:t>
+            </w:r>
+            <w:proofErr w:type="spellStart"/>
+            <w:r>
+              <w:rPr>
+                <w:rFonts w:ascii="Hind Siliguri" w:hAnsi="Hind Siliguri" w:cs="Hind Siliguri"/>
+                <w:color w:val="1E293B"/>
+                <w:sz w:val="28"/>
+                <w:szCs w:val="28"/>
+              </w:rPr>
+              <w:t>ক্রেন</w:t>
+            </w:r>
+            <w:proofErr w:type="spellEnd"/>
+            <w:r>
+              <w:rPr>
+                <w:rFonts w:ascii="Hind Siliguri" w:hAnsi="Hind Siliguri" w:cs="Hind Siliguri"/>
+                <w:color w:val="1E293B"/>
+                <w:sz w:val="28"/>
+                <w:szCs w:val="28"/>
+              </w:rPr>
+              <w:t xml:space="preserve"> </w:t>
+            </w:r>
+            <w:proofErr w:type="spellStart"/>
+            <w:r>
+              <w:rPr>
+                <w:rFonts w:ascii="Hind Siliguri" w:hAnsi="Hind Siliguri" w:cs="Hind Siliguri"/>
+                <w:color w:val="1E293B"/>
+                <w:sz w:val="28"/>
+                <w:szCs w:val="28"/>
+              </w:rPr>
+              <w:t>চার্জ</w:t>
+            </w:r>
+            <w:proofErr w:type="spellEnd"/>
           </w:p>
         </w:tc>
         <w:tc>
           <w:tcPr>
-            <w:tcW w:w="3237" w:type="dxa"/>
-            <w:tcBorders>
-              <w:top w:val="single" w:sz="4" w:space="0" w:color="CBD5E1"/>
-              <w:left w:val="single" w:sz="4" w:space="0" w:color="CBD5E1"/>
-              <w:bottom w:val="single" w:sz="4" w:space="0" w:color="CBD5E1"/>
-              <w:right w:val="single" w:sz="4" w:space="0" w:color="CBD5E1"/>
-            </w:tcBorders>
-            <w:shd w:val="clear" w:color="auto" w:fill="F8FAFC"/>
-            <w:tcMar>
-              <w:top w:w="45" w:type="dxa"/>
-              <w:left w:w="60" w:type="dxa"/>
-              <w:bottom w:w="45" w:type="dxa"/>
-              <w:right w:w="60" w:type="dxa"/>
-            </w:tcMar>
+            <w:tcW w:w="2340" w:type="dxa"/>
           </w:tcPr>
           <w:p>
             <w:pPr>
-              <w:spacing w:after="0"/>
               <w:jc w:val="right"/>
               <w:rPr>
                 <w:rFonts w:ascii="Hind Siliguri" w:hAnsi="Hind Siliguri" w:cs="Hind Siliguri"/>
+                <w:sz w:val="28"/>
+                <w:szCs w:val="28"/>
               </w:rPr>
             </w:pPr>
           </w:p>
@@ -1722,32 +2581,19 @@
       </w:tr>
       <w:tr>
         <w:trPr>
-          <w:trHeight w:val="346"/>
-          <w:jc w:val="center"/>
+          <w:trHeight w:val="463"/>
         </w:trPr>
         <w:tc>
           <w:tcPr>
-            <w:tcW w:w="576" w:type="dxa"/>
-            <w:tcBorders>
-              <w:top w:val="single" w:sz="4" w:space="0" w:color="CBD5E1"/>
-              <w:left w:val="single" w:sz="4" w:space="0" w:color="CBD5E1"/>
-              <w:bottom w:val="single" w:sz="4" w:space="0" w:color="CBD5E1"/>
-              <w:right w:val="single" w:sz="4" w:space="0" w:color="CBD5E1"/>
-            </w:tcBorders>
-            <w:shd w:val="clear" w:color="auto" w:fill="FFFFFF"/>
-            <w:tcMar>
-              <w:top w:w="45" w:type="dxa"/>
-              <w:left w:w="40" w:type="dxa"/>
-              <w:bottom w:w="45" w:type="dxa"/>
-              <w:right w:w="40" w:type="dxa"/>
-            </w:tcMar>
+            <w:tcW w:w="810" w:type="dxa"/>
           </w:tcPr>
           <w:p>
             <w:pPr>
-              <w:spacing w:after="0"/>
               <w:jc w:val="center"/>
               <w:rPr>
                 <w:rFonts w:ascii="Hind Siliguri" w:hAnsi="Hind Siliguri" w:cs="Hind Siliguri"/>
+                <w:sz w:val="28"/>
+                <w:szCs w:val="28"/>
               </w:rPr>
             </w:pPr>
             <w:r>
@@ -1755,69 +2601,189 @@
                 <w:rFonts w:ascii="Hind Siliguri" w:hAnsi="Hind Siliguri" w:cs="Hind Siliguri"/>
                 <w:b/>
                 <w:color w:val="0369A1"/>
-                <w:sz w:val="16"/>
-              </w:rPr>
-              <w:t>৯</w:t>
+                <w:sz w:val="28"/>
+                <w:szCs w:val="28"/>
+              </w:rPr>
+              <w:t>১০</w:t>
             </w:r>
           </w:p>
         </w:tc>
         <w:tc>
           <w:tcPr>
-            <w:tcW w:w="6871" w:type="dxa"/>
-            <w:tcBorders>
-              <w:top w:val="single" w:sz="4" w:space="0" w:color="CBD5E1"/>
-              <w:left w:val="single" w:sz="4" w:space="0" w:color="CBD5E1"/>
-              <w:bottom w:val="single" w:sz="4" w:space="0" w:color="CBD5E1"/>
-              <w:right w:val="single" w:sz="4" w:space="0" w:color="CBD5E1"/>
-            </w:tcBorders>
-            <w:shd w:val="clear" w:color="auto" w:fill="FFFFFF"/>
-            <w:tcMar>
-              <w:top w:w="45" w:type="dxa"/>
-              <w:left w:w="80" w:type="dxa"/>
-              <w:bottom w:w="45" w:type="dxa"/>
-              <w:right w:w="80" w:type="dxa"/>
-            </w:tcMar>
+            <w:tcW w:w="8010" w:type="dxa"/>
           </w:tcPr>
           <w:p>
             <w:pPr>
-              <w:spacing w:after="0"/>
-              <w:rPr>
-                <w:rFonts w:ascii="Hind Siliguri" w:hAnsi="Hind Siliguri" w:cs="Hind Siliguri"/>
+              <w:rPr>
+                <w:rFonts w:ascii="Hind Siliguri" w:hAnsi="Hind Siliguri" w:cs="Hind Siliguri"/>
+                <w:sz w:val="28"/>
+                <w:szCs w:val="28"/>
               </w:rPr>
             </w:pPr>
+            <w:proofErr w:type="spellStart"/>
             <w:r>
               <w:rPr>
                 <w:rFonts w:ascii="Hind Siliguri" w:hAnsi="Hind Siliguri" w:cs="Hind Siliguri"/>
                 <w:color w:val="1E293B"/>
-                <w:sz w:val="16"/>
-              </w:rPr>
-              <w:t>গোডাউন ভাড়া (জাবেদ আলি + জাহিদ আলি) বাবদ খরচ</w:t>
-            </w:r>
+                <w:sz w:val="28"/>
+                <w:szCs w:val="28"/>
+              </w:rPr>
+              <w:t>গোডাউন</w:t>
+            </w:r>
+            <w:proofErr w:type="spellEnd"/>
+            <w:r>
+              <w:rPr>
+                <w:rFonts w:ascii="Hind Siliguri" w:hAnsi="Hind Siliguri" w:cs="Hind Siliguri"/>
+                <w:color w:val="1E293B"/>
+                <w:sz w:val="28"/>
+                <w:szCs w:val="28"/>
+              </w:rPr>
+              <w:t xml:space="preserve"> </w:t>
+            </w:r>
+            <w:proofErr w:type="spellStart"/>
+            <w:r>
+              <w:rPr>
+                <w:rFonts w:ascii="Hind Siliguri" w:hAnsi="Hind Siliguri" w:cs="Hind Siliguri"/>
+                <w:color w:val="1E293B"/>
+                <w:sz w:val="28"/>
+                <w:szCs w:val="28"/>
+              </w:rPr>
+              <w:t>ভাড়া</w:t>
+            </w:r>
+            <w:proofErr w:type="spellEnd"/>
+            <w:r>
+              <w:rPr>
+                <w:rFonts w:ascii="Hind Siliguri" w:hAnsi="Hind Siliguri" w:cs="Hind Siliguri"/>
+                <w:color w:val="1E293B"/>
+                <w:sz w:val="28"/>
+                <w:szCs w:val="28"/>
+              </w:rPr>
+              <w:t xml:space="preserve"> (</w:t>
+            </w:r>
+            <w:proofErr w:type="spellStart"/>
+            <w:r>
+              <w:rPr>
+                <w:rFonts w:ascii="Hind Siliguri" w:hAnsi="Hind Siliguri" w:cs="Hind Siliguri"/>
+                <w:color w:val="1E293B"/>
+                <w:sz w:val="28"/>
+                <w:szCs w:val="28"/>
+              </w:rPr>
+              <w:t>জাবেদ</w:t>
+            </w:r>
+            <w:proofErr w:type="spellEnd"/>
+            <w:r>
+              <w:rPr>
+                <w:rFonts w:ascii="Hind Siliguri" w:hAnsi="Hind Siliguri" w:cs="Hind Siliguri"/>
+                <w:color w:val="1E293B"/>
+                <w:sz w:val="28"/>
+                <w:szCs w:val="28"/>
+              </w:rPr>
+              <w:t xml:space="preserve"> </w:t>
+            </w:r>
+            <w:proofErr w:type="spellStart"/>
+            <w:r>
+              <w:rPr>
+                <w:rFonts w:ascii="Hind Siliguri" w:hAnsi="Hind Siliguri" w:cs="Hind Siliguri"/>
+                <w:color w:val="1E293B"/>
+                <w:sz w:val="28"/>
+                <w:szCs w:val="28"/>
+              </w:rPr>
+              <w:t>আলি</w:t>
+            </w:r>
+            <w:proofErr w:type="spellEnd"/>
+            <w:r>
+              <w:rPr>
+                <w:rFonts w:ascii="Hind Siliguri" w:hAnsi="Hind Siliguri" w:cs="Hind Siliguri"/>
+                <w:color w:val="1E293B"/>
+                <w:sz w:val="28"/>
+                <w:szCs w:val="28"/>
+              </w:rPr>
+              <w:t xml:space="preserve"> + </w:t>
+            </w:r>
+            <w:proofErr w:type="spellStart"/>
+            <w:r>
+              <w:rPr>
+                <w:rFonts w:ascii="Hind Siliguri" w:hAnsi="Hind Siliguri" w:cs="Hind Siliguri"/>
+                <w:color w:val="1E293B"/>
+                <w:sz w:val="28"/>
+                <w:szCs w:val="28"/>
+              </w:rPr>
+              <w:t>জাহিদ</w:t>
+            </w:r>
+            <w:proofErr w:type="spellEnd"/>
+            <w:r>
+              <w:rPr>
+                <w:rFonts w:ascii="Hind Siliguri" w:hAnsi="Hind Siliguri" w:cs="Hind Siliguri"/>
+                <w:color w:val="1E293B"/>
+                <w:sz w:val="28"/>
+                <w:szCs w:val="28"/>
+              </w:rPr>
+              <w:t xml:space="preserve"> </w:t>
+            </w:r>
+            <w:proofErr w:type="spellStart"/>
+            <w:r>
+              <w:rPr>
+                <w:rFonts w:ascii="Hind Siliguri" w:hAnsi="Hind Siliguri" w:cs="Hind Siliguri"/>
+                <w:color w:val="1E293B"/>
+                <w:sz w:val="28"/>
+                <w:szCs w:val="28"/>
+              </w:rPr>
+              <w:t>আলি</w:t>
+            </w:r>
+            <w:proofErr w:type="spellEnd"/>
+            <w:r>
+              <w:rPr>
+                <w:rFonts w:ascii="Hind Siliguri" w:hAnsi="Hind Siliguri" w:cs="Hind Siliguri"/>
+                <w:color w:val="1E293B"/>
+                <w:sz w:val="28"/>
+                <w:szCs w:val="28"/>
+              </w:rPr>
+              <w:t xml:space="preserve">) </w:t>
+            </w:r>
+            <w:proofErr w:type="spellStart"/>
+            <w:r>
+              <w:rPr>
+                <w:rFonts w:ascii="Hind Siliguri" w:hAnsi="Hind Siliguri" w:cs="Hind Siliguri"/>
+                <w:color w:val="1E293B"/>
+                <w:sz w:val="28"/>
+                <w:szCs w:val="28"/>
+              </w:rPr>
+              <w:t>বাবদ</w:t>
+            </w:r>
+            <w:proofErr w:type="spellEnd"/>
+            <w:r>
+              <w:rPr>
+                <w:rFonts w:ascii="Hind Siliguri" w:hAnsi="Hind Siliguri" w:cs="Hind Siliguri"/>
+                <w:color w:val="1E293B"/>
+                <w:sz w:val="28"/>
+                <w:szCs w:val="28"/>
+              </w:rPr>
+              <w:t xml:space="preserve"> </w:t>
+            </w:r>
+            <w:proofErr w:type="spellStart"/>
+            <w:r>
+              <w:rPr>
+                <w:rFonts w:ascii="Hind Siliguri" w:hAnsi="Hind Siliguri" w:cs="Hind Siliguri"/>
+                <w:color w:val="1E293B"/>
+                <w:sz w:val="28"/>
+                <w:szCs w:val="28"/>
+              </w:rPr>
+              <w:t>খরচ</w:t>
+            </w:r>
+            <w:proofErr w:type="spellEnd"/>
           </w:p>
         </w:tc>
         <w:tc>
           <w:tcPr>
-            <w:tcW w:w="3237" w:type="dxa"/>
-            <w:tcBorders>
-              <w:top w:val="single" w:sz="4" w:space="0" w:color="CBD5E1"/>
-              <w:left w:val="single" w:sz="4" w:space="0" w:color="CBD5E1"/>
-              <w:bottom w:val="single" w:sz="4" w:space="0" w:color="CBD5E1"/>
-              <w:right w:val="single" w:sz="4" w:space="0" w:color="CBD5E1"/>
-            </w:tcBorders>
-            <w:shd w:val="clear" w:color="auto" w:fill="FFFFFF"/>
-            <w:tcMar>
-              <w:top w:w="45" w:type="dxa"/>
-              <w:left w:w="60" w:type="dxa"/>
-              <w:bottom w:w="45" w:type="dxa"/>
-              <w:right w:w="60" w:type="dxa"/>
-            </w:tcMar>
+            <w:tcW w:w="2340" w:type="dxa"/>
           </w:tcPr>
           <w:p>
             <w:pPr>
-              <w:spacing w:after="0"/>
               <w:jc w:val="right"/>
               <w:rPr>
                 <w:rFonts w:ascii="Hind Siliguri" w:hAnsi="Hind Siliguri" w:cs="Hind Siliguri"/>
+                <w:sz w:val="28"/>
+                <w:szCs w:val="28"/>
               </w:rPr>
             </w:pPr>
           </w:p>
@@ -1825,32 +2791,19 @@
       </w:tr>
       <w:tr>
         <w:trPr>
-          <w:trHeight w:val="346"/>
-          <w:jc w:val="center"/>
+          <w:trHeight w:val="463"/>
         </w:trPr>
         <w:tc>
           <w:tcPr>
-            <w:tcW w:w="576" w:type="dxa"/>
-            <w:tcBorders>
-              <w:top w:val="single" w:sz="4" w:space="0" w:color="CBD5E1"/>
-              <w:left w:val="single" w:sz="4" w:space="0" w:color="CBD5E1"/>
-              <w:bottom w:val="single" w:sz="4" w:space="0" w:color="CBD5E1"/>
-              <w:right w:val="single" w:sz="4" w:space="0" w:color="CBD5E1"/>
-            </w:tcBorders>
-            <w:shd w:val="clear" w:color="auto" w:fill="F8FAFC"/>
-            <w:tcMar>
-              <w:top w:w="45" w:type="dxa"/>
-              <w:left w:w="40" w:type="dxa"/>
-              <w:bottom w:w="45" w:type="dxa"/>
-              <w:right w:w="40" w:type="dxa"/>
-            </w:tcMar>
+            <w:tcW w:w="810" w:type="dxa"/>
           </w:tcPr>
           <w:p>
             <w:pPr>
-              <w:spacing w:after="0"/>
               <w:jc w:val="center"/>
               <w:rPr>
                 <w:rFonts w:ascii="Hind Siliguri" w:hAnsi="Hind Siliguri" w:cs="Hind Siliguri"/>
+                <w:sz w:val="28"/>
+                <w:szCs w:val="28"/>
               </w:rPr>
             </w:pPr>
             <w:r>
@@ -1858,69 +2811,218 @@
                 <w:rFonts w:ascii="Hind Siliguri" w:hAnsi="Hind Siliguri" w:cs="Hind Siliguri"/>
                 <w:b/>
                 <w:color w:val="0369A1"/>
-                <w:sz w:val="16"/>
-              </w:rPr>
-              <w:t>১০</w:t>
+                <w:sz w:val="28"/>
+                <w:szCs w:val="28"/>
+              </w:rPr>
+              <w:t>১১</w:t>
             </w:r>
           </w:p>
         </w:tc>
         <w:tc>
           <w:tcPr>
-            <w:tcW w:w="6871" w:type="dxa"/>
-            <w:tcBorders>
-              <w:top w:val="single" w:sz="4" w:space="0" w:color="CBD5E1"/>
-              <w:left w:val="single" w:sz="4" w:space="0" w:color="CBD5E1"/>
-              <w:bottom w:val="single" w:sz="4" w:space="0" w:color="CBD5E1"/>
-              <w:right w:val="single" w:sz="4" w:space="0" w:color="CBD5E1"/>
-            </w:tcBorders>
-            <w:shd w:val="clear" w:color="auto" w:fill="F8FAFC"/>
-            <w:tcMar>
-              <w:top w:w="45" w:type="dxa"/>
-              <w:left w:w="80" w:type="dxa"/>
-              <w:bottom w:w="45" w:type="dxa"/>
-              <w:right w:w="80" w:type="dxa"/>
-            </w:tcMar>
+            <w:tcW w:w="8010" w:type="dxa"/>
           </w:tcPr>
           <w:p>
             <w:pPr>
-              <w:spacing w:after="0"/>
-              <w:rPr>
-                <w:rFonts w:ascii="Hind Siliguri" w:hAnsi="Hind Siliguri" w:cs="Hind Siliguri"/>
+              <w:rPr>
+                <w:rFonts w:ascii="Hind Siliguri" w:hAnsi="Hind Siliguri" w:cs="Hind Siliguri"/>
+                <w:sz w:val="28"/>
+                <w:szCs w:val="28"/>
               </w:rPr>
             </w:pPr>
             <w:r>
               <w:rPr>
                 <w:rFonts w:ascii="Hind Siliguri" w:hAnsi="Hind Siliguri" w:cs="Hind Siliguri"/>
                 <w:color w:val="1E293B"/>
-                <w:sz w:val="16"/>
-              </w:rPr>
-              <w:t>C&amp;F কমিশন / পোর্ট বিল / শিপিং বিল / লেবার বিল DK ও হ্যান্ডলিং চার্জ</w:t>
-            </w:r>
+                <w:sz w:val="28"/>
+                <w:szCs w:val="28"/>
+              </w:rPr>
+              <w:t xml:space="preserve">C&amp;F </w:t>
+            </w:r>
+            <w:proofErr w:type="spellStart"/>
+            <w:r>
+              <w:rPr>
+                <w:rFonts w:ascii="Hind Siliguri" w:hAnsi="Hind Siliguri" w:cs="Hind Siliguri"/>
+                <w:color w:val="1E293B"/>
+                <w:sz w:val="28"/>
+                <w:szCs w:val="28"/>
+              </w:rPr>
+              <w:t>কমিশন</w:t>
+            </w:r>
+            <w:proofErr w:type="spellEnd"/>
+            <w:r>
+              <w:rPr>
+                <w:rFonts w:ascii="Hind Siliguri" w:hAnsi="Hind Siliguri" w:cs="Hind Siliguri"/>
+                <w:color w:val="1E293B"/>
+                <w:sz w:val="28"/>
+                <w:szCs w:val="28"/>
+              </w:rPr>
+              <w:t xml:space="preserve"> / </w:t>
+            </w:r>
+            <w:proofErr w:type="spellStart"/>
+            <w:r>
+              <w:rPr>
+                <w:rFonts w:ascii="Hind Siliguri" w:hAnsi="Hind Siliguri" w:cs="Hind Siliguri"/>
+                <w:color w:val="1E293B"/>
+                <w:sz w:val="28"/>
+                <w:szCs w:val="28"/>
+              </w:rPr>
+              <w:t>পোর্ট</w:t>
+            </w:r>
+            <w:proofErr w:type="spellEnd"/>
+            <w:r>
+              <w:rPr>
+                <w:rFonts w:ascii="Hind Siliguri" w:hAnsi="Hind Siliguri" w:cs="Hind Siliguri"/>
+                <w:color w:val="1E293B"/>
+                <w:sz w:val="28"/>
+                <w:szCs w:val="28"/>
+              </w:rPr>
+              <w:t xml:space="preserve"> </w:t>
+            </w:r>
+            <w:proofErr w:type="spellStart"/>
+            <w:r>
+              <w:rPr>
+                <w:rFonts w:ascii="Hind Siliguri" w:hAnsi="Hind Siliguri" w:cs="Hind Siliguri"/>
+                <w:color w:val="1E293B"/>
+                <w:sz w:val="28"/>
+                <w:szCs w:val="28"/>
+              </w:rPr>
+              <w:t>বিল</w:t>
+            </w:r>
+            <w:proofErr w:type="spellEnd"/>
+            <w:r>
+              <w:rPr>
+                <w:rFonts w:ascii="Hind Siliguri" w:hAnsi="Hind Siliguri" w:cs="Hind Siliguri"/>
+                <w:color w:val="1E293B"/>
+                <w:sz w:val="28"/>
+                <w:szCs w:val="28"/>
+              </w:rPr>
+              <w:t xml:space="preserve"> / </w:t>
+            </w:r>
+            <w:proofErr w:type="spellStart"/>
+            <w:r>
+              <w:rPr>
+                <w:rFonts w:ascii="Hind Siliguri" w:hAnsi="Hind Siliguri" w:cs="Hind Siliguri"/>
+                <w:color w:val="1E293B"/>
+                <w:sz w:val="28"/>
+                <w:szCs w:val="28"/>
+              </w:rPr>
+              <w:t>শিপিং</w:t>
+            </w:r>
+            <w:proofErr w:type="spellEnd"/>
+            <w:r>
+              <w:rPr>
+                <w:rFonts w:ascii="Hind Siliguri" w:hAnsi="Hind Siliguri" w:cs="Hind Siliguri"/>
+                <w:color w:val="1E293B"/>
+                <w:sz w:val="28"/>
+                <w:szCs w:val="28"/>
+              </w:rPr>
+              <w:t xml:space="preserve"> </w:t>
+            </w:r>
+            <w:proofErr w:type="spellStart"/>
+            <w:r>
+              <w:rPr>
+                <w:rFonts w:ascii="Hind Siliguri" w:hAnsi="Hind Siliguri" w:cs="Hind Siliguri"/>
+                <w:color w:val="1E293B"/>
+                <w:sz w:val="28"/>
+                <w:szCs w:val="28"/>
+              </w:rPr>
+              <w:t>বিল</w:t>
+            </w:r>
+            <w:proofErr w:type="spellEnd"/>
+            <w:r>
+              <w:rPr>
+                <w:rFonts w:ascii="Hind Siliguri" w:hAnsi="Hind Siliguri" w:cs="Hind Siliguri"/>
+                <w:color w:val="1E293B"/>
+                <w:sz w:val="28"/>
+                <w:szCs w:val="28"/>
+              </w:rPr>
+              <w:t xml:space="preserve"> / </w:t>
+            </w:r>
+            <w:proofErr w:type="spellStart"/>
+            <w:r>
+              <w:rPr>
+                <w:rFonts w:ascii="Hind Siliguri" w:hAnsi="Hind Siliguri" w:cs="Hind Siliguri"/>
+                <w:color w:val="1E293B"/>
+                <w:sz w:val="28"/>
+                <w:szCs w:val="28"/>
+              </w:rPr>
+              <w:t>লেবার</w:t>
+            </w:r>
+            <w:proofErr w:type="spellEnd"/>
+            <w:r>
+              <w:rPr>
+                <w:rFonts w:ascii="Hind Siliguri" w:hAnsi="Hind Siliguri" w:cs="Hind Siliguri"/>
+                <w:color w:val="1E293B"/>
+                <w:sz w:val="28"/>
+                <w:szCs w:val="28"/>
+              </w:rPr>
+              <w:t xml:space="preserve"> </w:t>
+            </w:r>
+            <w:proofErr w:type="spellStart"/>
+            <w:r>
+              <w:rPr>
+                <w:rFonts w:ascii="Hind Siliguri" w:hAnsi="Hind Siliguri" w:cs="Hind Siliguri"/>
+                <w:color w:val="1E293B"/>
+                <w:sz w:val="28"/>
+                <w:szCs w:val="28"/>
+              </w:rPr>
+              <w:t>বিল</w:t>
+            </w:r>
+            <w:proofErr w:type="spellEnd"/>
+            <w:r>
+              <w:rPr>
+                <w:rFonts w:ascii="Hind Siliguri" w:hAnsi="Hind Siliguri" w:cs="Hind Siliguri"/>
+                <w:color w:val="1E293B"/>
+                <w:sz w:val="28"/>
+                <w:szCs w:val="28"/>
+              </w:rPr>
+              <w:t xml:space="preserve"> DK ও </w:t>
+            </w:r>
+            <w:proofErr w:type="spellStart"/>
+            <w:r>
+              <w:rPr>
+                <w:rFonts w:ascii="Hind Siliguri" w:hAnsi="Hind Siliguri" w:cs="Hind Siliguri"/>
+                <w:color w:val="1E293B"/>
+                <w:sz w:val="28"/>
+                <w:szCs w:val="28"/>
+              </w:rPr>
+              <w:t>হ্যান্ডলিং</w:t>
+            </w:r>
+            <w:proofErr w:type="spellEnd"/>
+            <w:r>
+              <w:rPr>
+                <w:rFonts w:ascii="Hind Siliguri" w:hAnsi="Hind Siliguri" w:cs="Hind Siliguri"/>
+                <w:color w:val="1E293B"/>
+                <w:sz w:val="28"/>
+                <w:szCs w:val="28"/>
+              </w:rPr>
+              <w:t xml:space="preserve"> </w:t>
+            </w:r>
+            <w:proofErr w:type="spellStart"/>
+            <w:r>
+              <w:rPr>
+                <w:rFonts w:ascii="Hind Siliguri" w:hAnsi="Hind Siliguri" w:cs="Hind Siliguri"/>
+                <w:color w:val="1E293B"/>
+                <w:sz w:val="28"/>
+                <w:szCs w:val="28"/>
+              </w:rPr>
+              <w:t>চার্জ</w:t>
+            </w:r>
+            <w:proofErr w:type="spellEnd"/>
           </w:p>
         </w:tc>
         <w:tc>
           <w:tcPr>
-            <w:tcW w:w="3237" w:type="dxa"/>
-            <w:tcBorders>
-              <w:top w:val="single" w:sz="4" w:space="0" w:color="CBD5E1"/>
-              <w:left w:val="single" w:sz="4" w:space="0" w:color="CBD5E1"/>
-              <w:bottom w:val="single" w:sz="4" w:space="0" w:color="CBD5E1"/>
-              <w:right w:val="single" w:sz="4" w:space="0" w:color="CBD5E1"/>
-            </w:tcBorders>
-            <w:shd w:val="clear" w:color="auto" w:fill="F8FAFC"/>
-            <w:tcMar>
-              <w:top w:w="45" w:type="dxa"/>
-              <w:left w:w="60" w:type="dxa"/>
-              <w:bottom w:w="45" w:type="dxa"/>
-              <w:right w:w="60" w:type="dxa"/>
-            </w:tcMar>
+            <w:tcW w:w="2340" w:type="dxa"/>
           </w:tcPr>
           <w:p>
             <w:pPr>
-              <w:spacing w:after="0"/>
               <w:jc w:val="right"/>
               <w:rPr>
                 <w:rFonts w:ascii="Hind Siliguri" w:hAnsi="Hind Siliguri" w:cs="Hind Siliguri"/>
+                <w:sz w:val="28"/>
+                <w:szCs w:val="28"/>
               </w:rPr>
             </w:pPr>
           </w:p>
@@ -1928,32 +3030,19 @@
       </w:tr>
       <w:tr>
         <w:trPr>
-          <w:trHeight w:val="346"/>
-          <w:jc w:val="center"/>
+          <w:trHeight w:val="463"/>
         </w:trPr>
         <w:tc>
           <w:tcPr>
-            <w:tcW w:w="576" w:type="dxa"/>
-            <w:tcBorders>
-              <w:top w:val="single" w:sz="4" w:space="0" w:color="CBD5E1"/>
-              <w:left w:val="single" w:sz="4" w:space="0" w:color="CBD5E1"/>
-              <w:bottom w:val="single" w:sz="4" w:space="0" w:color="CBD5E1"/>
-              <w:right w:val="single" w:sz="4" w:space="0" w:color="CBD5E1"/>
-            </w:tcBorders>
-            <w:shd w:val="clear" w:color="auto" w:fill="FFFFFF"/>
-            <w:tcMar>
-              <w:top w:w="45" w:type="dxa"/>
-              <w:left w:w="40" w:type="dxa"/>
-              <w:bottom w:w="45" w:type="dxa"/>
-              <w:right w:w="40" w:type="dxa"/>
-            </w:tcMar>
+            <w:tcW w:w="810" w:type="dxa"/>
           </w:tcPr>
           <w:p>
             <w:pPr>
-              <w:spacing w:after="0"/>
               <w:jc w:val="center"/>
               <w:rPr>
                 <w:rFonts w:ascii="Hind Siliguri" w:hAnsi="Hind Siliguri" w:cs="Hind Siliguri"/>
+                <w:sz w:val="28"/>
+                <w:szCs w:val="28"/>
               </w:rPr>
             </w:pPr>
             <w:r>
@@ -1961,69 +3050,58 @@
                 <w:rFonts w:ascii="Hind Siliguri" w:hAnsi="Hind Siliguri" w:cs="Hind Siliguri"/>
                 <w:b/>
                 <w:color w:val="0369A1"/>
-                <w:sz w:val="16"/>
-              </w:rPr>
-              <w:t>১১</w:t>
+                <w:sz w:val="28"/>
+                <w:szCs w:val="28"/>
+              </w:rPr>
+              <w:t>১২</w:t>
             </w:r>
           </w:p>
         </w:tc>
         <w:tc>
           <w:tcPr>
-            <w:tcW w:w="6871" w:type="dxa"/>
-            <w:tcBorders>
-              <w:top w:val="single" w:sz="4" w:space="0" w:color="CBD5E1"/>
-              <w:left w:val="single" w:sz="4" w:space="0" w:color="CBD5E1"/>
-              <w:bottom w:val="single" w:sz="4" w:space="0" w:color="CBD5E1"/>
-              <w:right w:val="single" w:sz="4" w:space="0" w:color="CBD5E1"/>
-            </w:tcBorders>
-            <w:shd w:val="clear" w:color="auto" w:fill="FFFFFF"/>
-            <w:tcMar>
-              <w:top w:w="45" w:type="dxa"/>
-              <w:left w:w="80" w:type="dxa"/>
-              <w:bottom w:w="45" w:type="dxa"/>
-              <w:right w:w="80" w:type="dxa"/>
-            </w:tcMar>
+            <w:tcW w:w="8010" w:type="dxa"/>
           </w:tcPr>
           <w:p>
             <w:pPr>
-              <w:spacing w:after="0"/>
-              <w:rPr>
-                <w:rFonts w:ascii="Hind Siliguri" w:hAnsi="Hind Siliguri" w:cs="Hind Siliguri"/>
+              <w:rPr>
+                <w:rFonts w:ascii="Hind Siliguri" w:hAnsi="Hind Siliguri" w:cs="Hind Siliguri"/>
+                <w:sz w:val="28"/>
+                <w:szCs w:val="28"/>
               </w:rPr>
             </w:pPr>
+            <w:proofErr w:type="spellStart"/>
             <w:r>
               <w:rPr>
                 <w:rFonts w:ascii="Hind Siliguri" w:hAnsi="Hind Siliguri" w:cs="Hind Siliguri"/>
                 <w:color w:val="1E293B"/>
-                <w:sz w:val="16"/>
-              </w:rPr>
-              <w:t>ভ্যাট (VAT)</w:t>
+                <w:sz w:val="28"/>
+                <w:szCs w:val="28"/>
+              </w:rPr>
+              <w:t>ভ্যাট</w:t>
+            </w:r>
+            <w:proofErr w:type="spellEnd"/>
+            <w:r>
+              <w:rPr>
+                <w:rFonts w:ascii="Hind Siliguri" w:hAnsi="Hind Siliguri" w:cs="Hind Siliguri"/>
+                <w:color w:val="1E293B"/>
+                <w:sz w:val="28"/>
+                <w:szCs w:val="28"/>
+              </w:rPr>
+              <w:t xml:space="preserve"> (VAT)</w:t>
             </w:r>
           </w:p>
         </w:tc>
         <w:tc>
           <w:tcPr>
-            <w:tcW w:w="3237" w:type="dxa"/>
-            <w:tcBorders>
-              <w:top w:val="single" w:sz="4" w:space="0" w:color="CBD5E1"/>
-              <w:left w:val="single" w:sz="4" w:space="0" w:color="CBD5E1"/>
-              <w:bottom w:val="single" w:sz="4" w:space="0" w:color="CBD5E1"/>
-              <w:right w:val="single" w:sz="4" w:space="0" w:color="CBD5E1"/>
-            </w:tcBorders>
-            <w:shd w:val="clear" w:color="auto" w:fill="FFFFFF"/>
-            <w:tcMar>
-              <w:top w:w="45" w:type="dxa"/>
-              <w:left w:w="60" w:type="dxa"/>
-              <w:bottom w:w="45" w:type="dxa"/>
-              <w:right w:w="60" w:type="dxa"/>
-            </w:tcMar>
+            <w:tcW w:w="2340" w:type="dxa"/>
           </w:tcPr>
           <w:p>
             <w:pPr>
-              <w:spacing w:after="0"/>
               <w:jc w:val="right"/>
               <w:rPr>
                 <w:rFonts w:ascii="Hind Siliguri" w:hAnsi="Hind Siliguri" w:cs="Hind Siliguri"/>
+                <w:sz w:val="28"/>
+                <w:szCs w:val="28"/>
               </w:rPr>
             </w:pPr>
           </w:p>
@@ -2031,32 +3109,19 @@
       </w:tr>
       <w:tr>
         <w:trPr>
-          <w:trHeight w:val="346"/>
-          <w:jc w:val="center"/>
+          <w:trHeight w:val="463"/>
         </w:trPr>
         <w:tc>
           <w:tcPr>
-            <w:tcW w:w="576" w:type="dxa"/>
-            <w:tcBorders>
-              <w:top w:val="single" w:sz="4" w:space="0" w:color="CBD5E1"/>
-              <w:left w:val="single" w:sz="4" w:space="0" w:color="CBD5E1"/>
-              <w:bottom w:val="single" w:sz="4" w:space="0" w:color="CBD5E1"/>
-              <w:right w:val="single" w:sz="4" w:space="0" w:color="CBD5E1"/>
-            </w:tcBorders>
-            <w:shd w:val="clear" w:color="auto" w:fill="F8FAFC"/>
-            <w:tcMar>
-              <w:top w:w="45" w:type="dxa"/>
-              <w:left w:w="40" w:type="dxa"/>
-              <w:bottom w:w="45" w:type="dxa"/>
-              <w:right w:w="40" w:type="dxa"/>
-            </w:tcMar>
+            <w:tcW w:w="810" w:type="dxa"/>
           </w:tcPr>
           <w:p>
             <w:pPr>
-              <w:spacing w:after="0"/>
               <w:jc w:val="center"/>
               <w:rPr>
                 <w:rFonts w:ascii="Hind Siliguri" w:hAnsi="Hind Siliguri" w:cs="Hind Siliguri"/>
+                <w:sz w:val="28"/>
+                <w:szCs w:val="28"/>
               </w:rPr>
             </w:pPr>
             <w:r>
@@ -2064,61 +3129,38 @@
                 <w:rFonts w:ascii="Hind Siliguri" w:hAnsi="Hind Siliguri" w:cs="Hind Siliguri"/>
                 <w:b/>
                 <w:color w:val="0369A1"/>
-                <w:sz w:val="16"/>
-              </w:rPr>
-              <w:t>১২</w:t>
+                <w:sz w:val="28"/>
+                <w:szCs w:val="28"/>
+              </w:rPr>
+              <w:t>১৩</w:t>
             </w:r>
           </w:p>
         </w:tc>
         <w:tc>
           <w:tcPr>
-            <w:tcW w:w="6871" w:type="dxa"/>
-            <w:tcBorders>
-              <w:top w:val="single" w:sz="4" w:space="0" w:color="CBD5E1"/>
-              <w:left w:val="single" w:sz="4" w:space="0" w:color="CBD5E1"/>
-              <w:bottom w:val="single" w:sz="4" w:space="0" w:color="CBD5E1"/>
-              <w:right w:val="single" w:sz="4" w:space="0" w:color="CBD5E1"/>
-            </w:tcBorders>
-            <w:shd w:val="clear" w:color="auto" w:fill="F8FAFC"/>
-            <w:tcMar>
-              <w:top w:w="45" w:type="dxa"/>
-              <w:left w:w="80" w:type="dxa"/>
-              <w:bottom w:w="45" w:type="dxa"/>
-              <w:right w:w="80" w:type="dxa"/>
-            </w:tcMar>
+            <w:tcW w:w="8010" w:type="dxa"/>
           </w:tcPr>
           <w:p>
             <w:pPr>
-              <w:spacing w:after="0"/>
-              <w:rPr>
-                <w:rFonts w:ascii="Hind Siliguri" w:hAnsi="Hind Siliguri" w:cs="Hind Siliguri"/>
+              <w:rPr>
+                <w:rFonts w:ascii="Hind Siliguri" w:hAnsi="Hind Siliguri" w:cs="Hind Siliguri"/>
+                <w:sz w:val="28"/>
+                <w:szCs w:val="28"/>
               </w:rPr>
             </w:pPr>
           </w:p>
         </w:tc>
         <w:tc>
           <w:tcPr>
-            <w:tcW w:w="3237" w:type="dxa"/>
-            <w:tcBorders>
-              <w:top w:val="single" w:sz="4" w:space="0" w:color="CBD5E1"/>
-              <w:left w:val="single" w:sz="4" w:space="0" w:color="CBD5E1"/>
-              <w:bottom w:val="single" w:sz="4" w:space="0" w:color="CBD5E1"/>
-              <w:right w:val="single" w:sz="4" w:space="0" w:color="CBD5E1"/>
-            </w:tcBorders>
-            <w:shd w:val="clear" w:color="auto" w:fill="F8FAFC"/>
-            <w:tcMar>
-              <w:top w:w="45" w:type="dxa"/>
-              <w:left w:w="60" w:type="dxa"/>
-              <w:bottom w:w="45" w:type="dxa"/>
-              <w:right w:w="60" w:type="dxa"/>
-            </w:tcMar>
+            <w:tcW w:w="2340" w:type="dxa"/>
           </w:tcPr>
           <w:p>
             <w:pPr>
-              <w:spacing w:after="0"/>
               <w:jc w:val="right"/>
               <w:rPr>
                 <w:rFonts w:ascii="Hind Siliguri" w:hAnsi="Hind Siliguri" w:cs="Hind Siliguri"/>
+                <w:sz w:val="28"/>
+                <w:szCs w:val="28"/>
               </w:rPr>
             </w:pPr>
           </w:p>
@@ -2126,32 +3168,19 @@
       </w:tr>
       <w:tr>
         <w:trPr>
-          <w:trHeight w:val="346"/>
-          <w:jc w:val="center"/>
+          <w:trHeight w:val="463"/>
         </w:trPr>
         <w:tc>
           <w:tcPr>
-            <w:tcW w:w="576" w:type="dxa"/>
-            <w:tcBorders>
-              <w:top w:val="single" w:sz="4" w:space="0" w:color="CBD5E1"/>
-              <w:left w:val="single" w:sz="4" w:space="0" w:color="CBD5E1"/>
-              <w:bottom w:val="single" w:sz="4" w:space="0" w:color="CBD5E1"/>
-              <w:right w:val="single" w:sz="4" w:space="0" w:color="CBD5E1"/>
-            </w:tcBorders>
-            <w:shd w:val="clear" w:color="auto" w:fill="FFFFFF"/>
-            <w:tcMar>
-              <w:top w:w="45" w:type="dxa"/>
-              <w:left w:w="40" w:type="dxa"/>
-              <w:bottom w:w="45" w:type="dxa"/>
-              <w:right w:w="40" w:type="dxa"/>
-            </w:tcMar>
+            <w:tcW w:w="810" w:type="dxa"/>
           </w:tcPr>
           <w:p>
             <w:pPr>
-              <w:spacing w:after="0"/>
               <w:jc w:val="center"/>
               <w:rPr>
                 <w:rFonts w:ascii="Hind Siliguri" w:hAnsi="Hind Siliguri" w:cs="Hind Siliguri"/>
+                <w:sz w:val="28"/>
+                <w:szCs w:val="28"/>
               </w:rPr>
             </w:pPr>
             <w:r>
@@ -2159,61 +3188,38 @@
                 <w:rFonts w:ascii="Hind Siliguri" w:hAnsi="Hind Siliguri" w:cs="Hind Siliguri"/>
                 <w:b/>
                 <w:color w:val="0369A1"/>
-                <w:sz w:val="16"/>
-              </w:rPr>
-              <w:t>১৩</w:t>
+                <w:sz w:val="28"/>
+                <w:szCs w:val="28"/>
+              </w:rPr>
+              <w:t>১৪</w:t>
             </w:r>
           </w:p>
         </w:tc>
         <w:tc>
           <w:tcPr>
-            <w:tcW w:w="6871" w:type="dxa"/>
-            <w:tcBorders>
-              <w:top w:val="single" w:sz="4" w:space="0" w:color="CBD5E1"/>
-              <w:left w:val="single" w:sz="4" w:space="0" w:color="CBD5E1"/>
-              <w:bottom w:val="single" w:sz="4" w:space="0" w:color="CBD5E1"/>
-              <w:right w:val="single" w:sz="4" w:space="0" w:color="CBD5E1"/>
-            </w:tcBorders>
-            <w:shd w:val="clear" w:color="auto" w:fill="FFFFFF"/>
-            <w:tcMar>
-              <w:top w:w="45" w:type="dxa"/>
-              <w:left w:w="80" w:type="dxa"/>
-              <w:bottom w:w="45" w:type="dxa"/>
-              <w:right w:w="80" w:type="dxa"/>
-            </w:tcMar>
+            <w:tcW w:w="8010" w:type="dxa"/>
           </w:tcPr>
           <w:p>
             <w:pPr>
-              <w:spacing w:after="0"/>
-              <w:rPr>
-                <w:rFonts w:ascii="Hind Siliguri" w:hAnsi="Hind Siliguri" w:cs="Hind Siliguri"/>
+              <w:rPr>
+                <w:rFonts w:ascii="Hind Siliguri" w:hAnsi="Hind Siliguri" w:cs="Hind Siliguri"/>
+                <w:sz w:val="28"/>
+                <w:szCs w:val="28"/>
               </w:rPr>
             </w:pPr>
           </w:p>
         </w:tc>
         <w:tc>
           <w:tcPr>
-            <w:tcW w:w="3237" w:type="dxa"/>
-            <w:tcBorders>
-              <w:top w:val="single" w:sz="4" w:space="0" w:color="CBD5E1"/>
-              <w:left w:val="single" w:sz="4" w:space="0" w:color="CBD5E1"/>
-              <w:bottom w:val="single" w:sz="4" w:space="0" w:color="CBD5E1"/>
-              <w:right w:val="single" w:sz="4" w:space="0" w:color="CBD5E1"/>
-            </w:tcBorders>
-            <w:shd w:val="clear" w:color="auto" w:fill="FFFFFF"/>
-            <w:tcMar>
-              <w:top w:w="45" w:type="dxa"/>
-              <w:left w:w="60" w:type="dxa"/>
-              <w:bottom w:w="45" w:type="dxa"/>
-              <w:right w:w="60" w:type="dxa"/>
-            </w:tcMar>
+            <w:tcW w:w="2340" w:type="dxa"/>
           </w:tcPr>
           <w:p>
             <w:pPr>
-              <w:spacing w:after="0"/>
               <w:jc w:val="right"/>
               <w:rPr>
                 <w:rFonts w:ascii="Hind Siliguri" w:hAnsi="Hind Siliguri" w:cs="Hind Siliguri"/>
+                <w:sz w:val="28"/>
+                <w:szCs w:val="28"/>
               </w:rPr>
             </w:pPr>
           </w:p>
@@ -2221,32 +3227,19 @@
       </w:tr>
       <w:tr>
         <w:trPr>
-          <w:trHeight w:val="346"/>
-          <w:jc w:val="center"/>
+          <w:trHeight w:val="463"/>
         </w:trPr>
         <w:tc>
           <w:tcPr>
-            <w:tcW w:w="576" w:type="dxa"/>
-            <w:tcBorders>
-              <w:top w:val="single" w:sz="4" w:space="0" w:color="CBD5E1"/>
-              <w:left w:val="single" w:sz="4" w:space="0" w:color="CBD5E1"/>
-              <w:bottom w:val="single" w:sz="4" w:space="0" w:color="CBD5E1"/>
-              <w:right w:val="single" w:sz="4" w:space="0" w:color="CBD5E1"/>
-            </w:tcBorders>
-            <w:shd w:val="clear" w:color="auto" w:fill="F8FAFC"/>
-            <w:tcMar>
-              <w:top w:w="45" w:type="dxa"/>
-              <w:left w:w="40" w:type="dxa"/>
-              <w:bottom w:w="45" w:type="dxa"/>
-              <w:right w:w="40" w:type="dxa"/>
-            </w:tcMar>
+            <w:tcW w:w="810" w:type="dxa"/>
           </w:tcPr>
           <w:p>
             <w:pPr>
-              <w:spacing w:after="0"/>
               <w:jc w:val="center"/>
               <w:rPr>
                 <w:rFonts w:ascii="Hind Siliguri" w:hAnsi="Hind Siliguri" w:cs="Hind Siliguri"/>
+                <w:sz w:val="28"/>
+                <w:szCs w:val="28"/>
               </w:rPr>
             </w:pPr>
             <w:r>
@@ -2254,61 +3247,38 @@
                 <w:rFonts w:ascii="Hind Siliguri" w:hAnsi="Hind Siliguri" w:cs="Hind Siliguri"/>
                 <w:b/>
                 <w:color w:val="0369A1"/>
-                <w:sz w:val="16"/>
-              </w:rPr>
-              <w:t>১৪</w:t>
+                <w:sz w:val="28"/>
+                <w:szCs w:val="28"/>
+              </w:rPr>
+              <w:t>১৫</w:t>
             </w:r>
           </w:p>
         </w:tc>
         <w:tc>
           <w:tcPr>
-            <w:tcW w:w="6871" w:type="dxa"/>
-            <w:tcBorders>
-              <w:top w:val="single" w:sz="4" w:space="0" w:color="CBD5E1"/>
-              <w:left w:val="single" w:sz="4" w:space="0" w:color="CBD5E1"/>
-              <w:bottom w:val="single" w:sz="4" w:space="0" w:color="CBD5E1"/>
-              <w:right w:val="single" w:sz="4" w:space="0" w:color="CBD5E1"/>
-            </w:tcBorders>
-            <w:shd w:val="clear" w:color="auto" w:fill="F8FAFC"/>
-            <w:tcMar>
-              <w:top w:w="45" w:type="dxa"/>
-              <w:left w:w="80" w:type="dxa"/>
-              <w:bottom w:w="45" w:type="dxa"/>
-              <w:right w:w="80" w:type="dxa"/>
-            </w:tcMar>
+            <w:tcW w:w="8010" w:type="dxa"/>
           </w:tcPr>
           <w:p>
             <w:pPr>
-              <w:spacing w:after="0"/>
-              <w:rPr>
-                <w:rFonts w:ascii="Hind Siliguri" w:hAnsi="Hind Siliguri" w:cs="Hind Siliguri"/>
+              <w:rPr>
+                <w:rFonts w:ascii="Hind Siliguri" w:hAnsi="Hind Siliguri" w:cs="Hind Siliguri"/>
+                <w:sz w:val="28"/>
+                <w:szCs w:val="28"/>
               </w:rPr>
             </w:pPr>
           </w:p>
         </w:tc>
         <w:tc>
           <w:tcPr>
-            <w:tcW w:w="3237" w:type="dxa"/>
-            <w:tcBorders>
-              <w:top w:val="single" w:sz="4" w:space="0" w:color="CBD5E1"/>
-              <w:left w:val="single" w:sz="4" w:space="0" w:color="CBD5E1"/>
-              <w:bottom w:val="single" w:sz="4" w:space="0" w:color="CBD5E1"/>
-              <w:right w:val="single" w:sz="4" w:space="0" w:color="CBD5E1"/>
-            </w:tcBorders>
-            <w:shd w:val="clear" w:color="auto" w:fill="F8FAFC"/>
-            <w:tcMar>
-              <w:top w:w="45" w:type="dxa"/>
-              <w:left w:w="60" w:type="dxa"/>
-              <w:bottom w:w="45" w:type="dxa"/>
-              <w:right w:w="60" w:type="dxa"/>
-            </w:tcMar>
+            <w:tcW w:w="2340" w:type="dxa"/>
           </w:tcPr>
           <w:p>
             <w:pPr>
-              <w:spacing w:after="0"/>
               <w:jc w:val="right"/>
               <w:rPr>
                 <w:rFonts w:ascii="Hind Siliguri" w:hAnsi="Hind Siliguri" w:cs="Hind Siliguri"/>
+                <w:sz w:val="28"/>
+                <w:szCs w:val="28"/>
               </w:rPr>
             </w:pPr>
           </w:p>
@@ -2316,243 +3286,132 @@
       </w:tr>
       <w:tr>
         <w:trPr>
-          <w:trHeight w:val="346"/>
-          <w:jc w:val="center"/>
+          <w:trHeight w:val="347"/>
         </w:trPr>
         <w:tc>
           <w:tcPr>
-            <w:tcW w:w="576" w:type="dxa"/>
-            <w:tcBorders>
-              <w:top w:val="single" w:sz="4" w:space="0" w:color="CBD5E1"/>
-              <w:left w:val="single" w:sz="4" w:space="0" w:color="CBD5E1"/>
-              <w:bottom w:val="single" w:sz="4" w:space="0" w:color="CBD5E1"/>
-              <w:right w:val="single" w:sz="4" w:space="0" w:color="CBD5E1"/>
-            </w:tcBorders>
-            <w:shd w:val="clear" w:color="auto" w:fill="FFFFFF"/>
-            <w:tcMar>
-              <w:top w:w="45" w:type="dxa"/>
-              <w:left w:w="40" w:type="dxa"/>
-              <w:bottom w:w="45" w:type="dxa"/>
-              <w:right w:w="40" w:type="dxa"/>
-            </w:tcMar>
+            <w:tcW w:w="8820" w:type="dxa"/>
+            <w:gridSpan w:val="2"/>
           </w:tcPr>
           <w:p>
             <w:pPr>
-              <w:spacing w:after="0"/>
-              <w:jc w:val="center"/>
-              <w:rPr>
-                <w:rFonts w:ascii="Hind Siliguri" w:hAnsi="Hind Siliguri" w:cs="Hind Siliguri"/>
+              <w:jc w:val="right"/>
+              <w:rPr>
+                <w:rFonts w:ascii="Hind Siliguri" w:hAnsi="Hind Siliguri" w:cs="Hind Siliguri"/>
+                <w:sz w:val="28"/>
+                <w:szCs w:val="28"/>
               </w:rPr>
             </w:pPr>
+            <w:proofErr w:type="spellStart"/>
             <w:r>
               <w:rPr>
                 <w:rFonts w:ascii="Hind Siliguri" w:hAnsi="Hind Siliguri" w:cs="Hind Siliguri"/>
                 <w:b/>
                 <w:color w:val="0369A1"/>
-                <w:sz w:val="16"/>
-              </w:rPr>
-              <w:t>১৫</w:t>
+                <w:sz w:val="28"/>
+                <w:szCs w:val="28"/>
+              </w:rPr>
+              <w:t>প্রতি</w:t>
+            </w:r>
+            <w:proofErr w:type="spellEnd"/>
+            <w:r>
+              <w:rPr>
+                <w:rFonts w:ascii="Hind Siliguri" w:hAnsi="Hind Siliguri" w:cs="Hind Siliguri"/>
+                <w:b/>
+                <w:color w:val="0369A1"/>
+                <w:sz w:val="28"/>
+                <w:szCs w:val="28"/>
+              </w:rPr>
+              <w:t xml:space="preserve"> </w:t>
+            </w:r>
+            <w:proofErr w:type="spellStart"/>
+            <w:r>
+              <w:rPr>
+                <w:rFonts w:ascii="Hind Siliguri" w:hAnsi="Hind Siliguri" w:cs="Hind Siliguri"/>
+                <w:b/>
+                <w:color w:val="0369A1"/>
+                <w:sz w:val="28"/>
+                <w:szCs w:val="28"/>
+              </w:rPr>
+              <w:t>কন্টেইনার</w:t>
+            </w:r>
+            <w:proofErr w:type="spellEnd"/>
+            <w:r>
+              <w:rPr>
+                <w:rFonts w:ascii="Hind Siliguri" w:hAnsi="Hind Siliguri" w:cs="Hind Siliguri"/>
+                <w:b/>
+                <w:color w:val="0369A1"/>
+                <w:sz w:val="28"/>
+                <w:szCs w:val="28"/>
+              </w:rPr>
+              <w:t xml:space="preserve"> </w:t>
+            </w:r>
+            <w:proofErr w:type="spellStart"/>
+            <w:r>
+              <w:rPr>
+                <w:rFonts w:ascii="Hind Siliguri" w:hAnsi="Hind Siliguri" w:cs="Hind Siliguri"/>
+                <w:b/>
+                <w:color w:val="0369A1"/>
+                <w:sz w:val="28"/>
+                <w:szCs w:val="28"/>
+              </w:rPr>
+              <w:t>সর্বমোট</w:t>
+            </w:r>
+            <w:proofErr w:type="spellEnd"/>
+            <w:r>
+              <w:rPr>
+                <w:rFonts w:ascii="Hind Siliguri" w:hAnsi="Hind Siliguri" w:cs="Hind Siliguri"/>
+                <w:b/>
+                <w:color w:val="0369A1"/>
+                <w:sz w:val="28"/>
+                <w:szCs w:val="28"/>
+              </w:rPr>
+              <w:t xml:space="preserve"> </w:t>
+            </w:r>
+            <w:proofErr w:type="spellStart"/>
+            <w:r>
+              <w:rPr>
+                <w:rFonts w:ascii="Hind Siliguri" w:hAnsi="Hind Siliguri" w:cs="Hind Siliguri"/>
+                <w:b/>
+                <w:color w:val="0369A1"/>
+                <w:sz w:val="28"/>
+                <w:szCs w:val="28"/>
+              </w:rPr>
+              <w:t>খালাস</w:t>
+            </w:r>
+            <w:proofErr w:type="spellEnd"/>
+            <w:r>
+              <w:rPr>
+                <w:rFonts w:ascii="Hind Siliguri" w:hAnsi="Hind Siliguri" w:cs="Hind Siliguri"/>
+                <w:b/>
+                <w:color w:val="0369A1"/>
+                <w:sz w:val="28"/>
+                <w:szCs w:val="28"/>
+              </w:rPr>
+              <w:t xml:space="preserve"> খরচ (TOTAL EXPENSES):</w:t>
             </w:r>
           </w:p>
         </w:tc>
         <w:tc>
           <w:tcPr>
-            <w:tcW w:w="6871" w:type="dxa"/>
-            <w:tcBorders>
-              <w:top w:val="single" w:sz="4" w:space="0" w:color="CBD5E1"/>
-              <w:left w:val="single" w:sz="4" w:space="0" w:color="CBD5E1"/>
-              <w:bottom w:val="single" w:sz="4" w:space="0" w:color="CBD5E1"/>
-              <w:right w:val="single" w:sz="4" w:space="0" w:color="CBD5E1"/>
-            </w:tcBorders>
-            <w:shd w:val="clear" w:color="auto" w:fill="FFFFFF"/>
-            <w:tcMar>
-              <w:top w:w="45" w:type="dxa"/>
-              <w:left w:w="80" w:type="dxa"/>
-              <w:bottom w:w="45" w:type="dxa"/>
-              <w:right w:w="80" w:type="dxa"/>
-            </w:tcMar>
+            <w:tcW w:w="2340" w:type="dxa"/>
           </w:tcPr>
           <w:p>
             <w:pPr>
-              <w:spacing w:after="0"/>
-              <w:rPr>
-                <w:rFonts w:ascii="Hind Siliguri" w:hAnsi="Hind Siliguri" w:cs="Hind Siliguri"/>
+              <w:jc w:val="right"/>
+              <w:rPr>
+                <w:rFonts w:ascii="Hind Siliguri" w:hAnsi="Hind Siliguri" w:cs="Hind Siliguri"/>
+                <w:sz w:val="28"/>
+                <w:szCs w:val="28"/>
               </w:rPr>
             </w:pPr>
-          </w:p>
-        </w:tc>
-        <w:tc>
-          <w:tcPr>
-            <w:tcW w:w="3237" w:type="dxa"/>
-            <w:tcBorders>
-              <w:top w:val="single" w:sz="4" w:space="0" w:color="CBD5E1"/>
-              <w:left w:val="single" w:sz="4" w:space="0" w:color="CBD5E1"/>
-              <w:bottom w:val="single" w:sz="4" w:space="0" w:color="CBD5E1"/>
-              <w:right w:val="single" w:sz="4" w:space="0" w:color="CBD5E1"/>
-            </w:tcBorders>
-            <w:shd w:val="clear" w:color="auto" w:fill="FFFFFF"/>
-            <w:tcMar>
-              <w:top w:w="45" w:type="dxa"/>
-              <w:left w:w="60" w:type="dxa"/>
-              <w:bottom w:w="45" w:type="dxa"/>
-              <w:right w:w="60" w:type="dxa"/>
-            </w:tcMar>
-          </w:tcPr>
-          <w:p>
-            <w:pPr>
-              <w:spacing w:after="0"/>
-              <w:jc w:val="right"/>
-              <w:rPr>
-                <w:rFonts w:ascii="Hind Siliguri" w:hAnsi="Hind Siliguri" w:cs="Hind Siliguri"/>
-              </w:rPr>
-            </w:pPr>
-          </w:p>
-        </w:tc>
-      </w:tr>
-      <w:tr>
-        <w:trPr>
-          <w:trHeight w:val="259"/>
-          <w:jc w:val="center"/>
-        </w:trPr>
-        <w:tc>
-          <w:tcPr>
-            <w:tcW w:w="7447" w:type="dxa"/>
-            <w:gridSpan w:val="2"/>
-            <w:tcBorders>
-              <w:top w:val="single" w:sz="6" w:space="0" w:color="0369A1"/>
-              <w:left w:val="single" w:sz="6" w:space="0" w:color="CBD5E1"/>
-              <w:bottom w:val="single" w:sz="6" w:space="0" w:color="0369A1"/>
-              <w:right w:val="single" w:sz="6" w:space="0" w:color="CBD5E1"/>
-            </w:tcBorders>
-            <w:shd w:val="clear" w:color="auto" w:fill="E0F2FE"/>
-            <w:tcMar>
-              <w:top w:w="60" w:type="dxa"/>
-              <w:left w:w="80" w:type="dxa"/>
-              <w:bottom w:w="60" w:type="dxa"/>
-              <w:right w:w="80" w:type="dxa"/>
-            </w:tcMar>
-          </w:tcPr>
-          <w:p>
-            <w:pPr>
-              <w:spacing w:after="0"/>
-              <w:jc w:val="right"/>
-              <w:rPr>
-                <w:rFonts w:ascii="Hind Siliguri" w:hAnsi="Hind Siliguri" w:cs="Hind Siliguri"/>
-              </w:rPr>
-            </w:pPr>
-            <w:proofErr w:type="spellStart"/>
             <w:r>
               <w:rPr>
                 <w:rFonts w:ascii="Hind Siliguri" w:hAnsi="Hind Siliguri" w:cs="Hind Siliguri"/>
                 <w:b/>
                 <w:color w:val="0369A1"/>
-                <w:sz w:val="17"/>
-              </w:rPr>
-              <w:t>প্রতি</w:t>
-            </w:r>
-            <w:proofErr w:type="spellEnd"/>
-            <w:r>
-              <w:rPr>
-                <w:rFonts w:ascii="Hind Siliguri" w:hAnsi="Hind Siliguri" w:cs="Hind Siliguri"/>
-                <w:b/>
-                <w:color w:val="0369A1"/>
-                <w:sz w:val="17"/>
-              </w:rPr>
-              <w:t xml:space="preserve"> </w:t>
-            </w:r>
-            <w:proofErr w:type="spellStart"/>
-            <w:r>
-              <w:rPr>
-                <w:rFonts w:ascii="Hind Siliguri" w:hAnsi="Hind Siliguri" w:cs="Hind Siliguri"/>
-                <w:b/>
-                <w:color w:val="0369A1"/>
-                <w:sz w:val="17"/>
-              </w:rPr>
-              <w:t>কন্টেইনার</w:t>
-            </w:r>
-            <w:proofErr w:type="spellEnd"/>
-            <w:r>
-              <w:rPr>
-                <w:rFonts w:ascii="Hind Siliguri" w:hAnsi="Hind Siliguri" w:cs="Hind Siliguri"/>
-                <w:b/>
-                <w:color w:val="0369A1"/>
-                <w:sz w:val="17"/>
-              </w:rPr>
-              <w:t xml:space="preserve"> </w:t>
-            </w:r>
-            <w:proofErr w:type="spellStart"/>
-            <w:r>
-              <w:rPr>
-                <w:rFonts w:ascii="Hind Siliguri" w:hAnsi="Hind Siliguri" w:cs="Hind Siliguri"/>
-                <w:b/>
-                <w:color w:val="0369A1"/>
-                <w:sz w:val="17"/>
-              </w:rPr>
-              <w:t>সর্বমোট</w:t>
-            </w:r>
-            <w:proofErr w:type="spellEnd"/>
-            <w:r>
-              <w:rPr>
-                <w:rFonts w:ascii="Hind Siliguri" w:hAnsi="Hind Siliguri" w:cs="Hind Siliguri"/>
-                <w:b/>
-                <w:color w:val="0369A1"/>
-                <w:sz w:val="17"/>
-              </w:rPr>
-              <w:t xml:space="preserve"> </w:t>
-            </w:r>
-            <w:proofErr w:type="spellStart"/>
-            <w:r>
-              <w:rPr>
-                <w:rFonts w:ascii="Hind Siliguri" w:hAnsi="Hind Siliguri" w:cs="Hind Siliguri"/>
-                <w:b/>
-                <w:color w:val="0369A1"/>
-                <w:sz w:val="17"/>
-              </w:rPr>
-              <w:t>খালাস</w:t>
-            </w:r>
-            <w:proofErr w:type="spellEnd"/>
-            <w:r>
-              <w:rPr>
-                <w:rFonts w:ascii="Hind Siliguri" w:hAnsi="Hind Siliguri" w:cs="Hind Siliguri"/>
-                <w:b/>
-                <w:color w:val="0369A1"/>
-                <w:sz w:val="17"/>
-              </w:rPr>
-              <w:t xml:space="preserve"> খরচ (TOTAL EXPENSES):</w:t>
-            </w:r>
-          </w:p>
-        </w:tc>
-        <w:tc>
-          <w:tcPr>
-            <w:tcW w:w="3237" w:type="dxa"/>
-            <w:tcBorders>
-              <w:top w:val="single" w:sz="6" w:space="0" w:color="0369A1"/>
-              <w:left w:val="single" w:sz="6" w:space="0" w:color="CBD5E1"/>
-              <w:bottom w:val="single" w:sz="6" w:space="0" w:color="0369A1"/>
-              <w:right w:val="single" w:sz="6" w:space="0" w:color="CBD5E1"/>
-            </w:tcBorders>
-            <w:shd w:val="clear" w:color="auto" w:fill="E0F2FE"/>
-            <w:tcMar>
-              <w:top w:w="60" w:type="dxa"/>
-              <w:left w:w="60" w:type="dxa"/>
-              <w:bottom w:w="60" w:type="dxa"/>
-              <w:right w:w="60" w:type="dxa"/>
-            </w:tcMar>
-          </w:tcPr>
-          <w:p>
-            <w:pPr>
-              <w:spacing w:after="0"/>
-              <w:jc w:val="right"/>
-              <w:rPr>
-                <w:rFonts w:ascii="Hind Siliguri" w:hAnsi="Hind Siliguri" w:cs="Hind Siliguri"/>
-              </w:rPr>
-            </w:pPr>
-            <w:r>
-              <w:rPr>
-                <w:rFonts w:ascii="Hind Siliguri" w:hAnsi="Hind Siliguri" w:cs="Hind Siliguri"/>
-                <w:b/>
-                <w:color w:val="0369A1"/>
-                <w:sz w:val="17"/>
+                <w:sz w:val="28"/>
+                <w:szCs w:val="28"/>
               </w:rPr>
               <w:t xml:space="preserve">            </w:t>
             </w:r>
@@ -2570,88 +3429,6 @@
           <w:sz w:val="17"/>
         </w:rPr>
       </w:pPr>
-    </w:p>
-    <w:p>
-      <w:pPr>
-        <w:spacing w:before="120" w:after="160"/>
-        <w:rPr>
-          <w:rFonts w:ascii="Hind Siliguri" w:hAnsi="Hind Siliguri" w:cs="Hind Siliguri"/>
-          <w:color w:val="94A3B8"/>
-          <w:sz w:val="16"/>
-        </w:rPr>
-      </w:pPr>
-      <w:proofErr w:type="spellStart"/>
-      <w:r>
-        <w:rPr>
-          <w:rFonts w:ascii="Hind Siliguri" w:hAnsi="Hind Siliguri" w:cs="Hind Siliguri"/>
-          <w:b/>
-          <w:color w:val="0369A1"/>
-          <w:sz w:val="17"/>
-        </w:rPr>
-        <w:t>কথায়</w:t>
-      </w:r>
-      <w:proofErr w:type="spellEnd"/>
-      <w:r>
-        <w:rPr>
-          <w:rFonts w:ascii="Hind Siliguri" w:hAnsi="Hind Siliguri" w:cs="Hind Siliguri"/>
-          <w:b/>
-          <w:color w:val="0369A1"/>
-          <w:sz w:val="17"/>
-        </w:rPr>
-        <w:t xml:space="preserve"> (In Words): </w:t>
-      </w:r>
-      <w:r>
-        <w:rPr>
-          <w:rFonts w:ascii="Hind Siliguri" w:hAnsi="Hind Siliguri" w:cs="Hind Siliguri"/>
-          <w:color w:val="94A3B8"/>
-          <w:sz w:val="16"/>
-        </w:rPr>
-        <w:t>.........................................................................................................................................................................................................</w:t>
-      </w:r>
-      <w:r>
-        <w:rPr>
-          <w:rFonts w:ascii="Hind Siliguri" w:hAnsi="Hind Siliguri" w:cs="Hind Siliguri"/>
-          <w:color w:val="94A3B8"/>
-          <w:sz w:val="16"/>
-        </w:rPr>
-        <w:t xml:space="preserve">........................................................................ </w:t>
-      </w:r>
-      <w:proofErr w:type="spellStart"/>
-      <w:r>
-        <w:rPr>
-          <w:rFonts w:ascii="Hind Siliguri" w:hAnsi="Hind Siliguri" w:cs="Hind Siliguri"/>
-          <w:color w:val="94A3B8"/>
-          <w:sz w:val="16"/>
-        </w:rPr>
-        <w:t>টাকা</w:t>
-      </w:r>
-      <w:proofErr w:type="spellEnd"/>
-      <w:r>
-        <w:rPr>
-          <w:rFonts w:ascii="Hind Siliguri" w:hAnsi="Hind Siliguri" w:cs="Hind Siliguri"/>
-          <w:color w:val="94A3B8"/>
-          <w:sz w:val="16"/>
-        </w:rPr>
-        <w:t xml:space="preserve"> </w:t>
-      </w:r>
-      <w:proofErr w:type="spellStart"/>
-      <w:r>
-        <w:rPr>
-          <w:rFonts w:ascii="Hind Siliguri" w:hAnsi="Hind Siliguri" w:cs="Hind Siliguri"/>
-          <w:color w:val="94A3B8"/>
-          <w:sz w:val="16"/>
-        </w:rPr>
-        <w:t>মাত্র</w:t>
-      </w:r>
-      <w:proofErr w:type="spellEnd"/>
-      <w:r>
-        <w:rPr>
-          <w:rFonts w:ascii="Hind Siliguri" w:hAnsi="Hind Siliguri" w:cs="Hind Siliguri"/>
-          <w:color w:val="94A3B8"/>
-          <w:sz w:val="16"/>
-        </w:rPr>
-        <w:t>।</w:t>
-      </w:r>
     </w:p>
     <w:p>
       <w:pPr>
@@ -2893,7 +3670,7 @@
       </w:pPr>
     </w:p>
     <w:sectPr>
-      <w:headerReference w:type="default" r:id="rId10"/>
+      <w:headerReference w:type="default" r:id="rId9"/>
       <w:pgSz w:w="11909" w:h="16834"/>
       <w:pgMar w:top="504" w:right="648" w:bottom="504" w:left="648" w:header="720" w:footer="720" w:gutter="0"/>
       <w:cols w:space="720"/>
@@ -3096,7 +3873,7 @@
         </mc:Choice>
         <mc:Fallback>
           <w:pict>
-            <v:roundrect w14:anchorId="519C1FCD" id="Rectangle: Rounded Corners 1" o:spid="_x0000_s1026" style="position:absolute;margin-left:125.1pt;margin-top:-26pt;width:236pt;height:27.5pt;z-index:251659264;visibility:visible;mso-wrap-style:square;mso-wrap-distance-left:9pt;mso-wrap-distance-top:0;mso-wrap-distance-right:9pt;mso-wrap-distance-bottom:0;mso-position-horizontal:absolute;mso-position-horizontal-relative:text;mso-position-vertical:absolute;mso-position-vertical-relative:text;v-text-anchor:middle" arcsize="10923f" o:gfxdata="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" filled="f" stroked="f">
+            <v:roundrect w14:anchorId="519C1FCD" id="Rectangle: Rounded Corners 1" o:spid="_x0000_s1027" style="position:absolute;margin-left:125.1pt;margin-top:-26pt;width:236pt;height:27.5pt;z-index:251659264;visibility:visible;mso-wrap-style:square;mso-wrap-distance-left:9pt;mso-wrap-distance-top:0;mso-wrap-distance-right:9pt;mso-wrap-distance-bottom:0;mso-position-horizontal:absolute;mso-position-horizontal-relative:text;mso-position-vertical:absolute;mso-position-vertical-relative:text;v-text-anchor:middle" arcsize="10923f" o:gfxdata="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" filled="f" stroked="f">
               <v:shadow on="t" color="black" opacity="22937f" origin=",.5" offset="0,.63889mm"/>
               <v:textbox>
                 <w:txbxContent>
@@ -3985,7 +4762,6 @@
   <w:style w:type="character" w:default="1" w:styleId="DefaultParagraphFont">
     <w:name w:val="Default Paragraph Font"/>
     <w:uiPriority w:val="1"/>
-    <w:semiHidden/>
     <w:unhideWhenUsed/>
   </w:style>
   <w:style w:type="table" w:default="1" w:styleId="TableNormal">

</xml_diff>